<commit_message>
Adding V15 on my Resume
</commit_message>
<xml_diff>
--- a/Profile Insights/HaryishElangumaranQA-MODEL2.docx
+++ b/Profile Insights/HaryishElangumaranQA-MODEL2.docx
@@ -329,6 +329,14 @@
         </w:rPr>
         <w:t xml:space="preserve">Selenium (Java &amp; Python), Cypress, </w:t>
       </w:r>
+      <w:r>
+        <w:rPr>
+          <w:b/>
+          <w:bCs/>
+          <w:lang w:val="en-IN"/>
+        </w:rPr>
+        <w:t xml:space="preserve">TestNG, </w:t>
+      </w:r>
       <w:proofErr w:type="spellStart"/>
       <w:r>
         <w:rPr>
@@ -569,13 +577,7 @@
         <w:rPr>
           <w:rStyle w:val="NotBold"/>
         </w:rPr>
-        <w:t>Dec</w:t>
-      </w:r>
-      <w:r>
-        <w:rPr>
-          <w:rStyle w:val="NotBold"/>
-        </w:rPr>
-        <w:t xml:space="preserve"> 2025</w:t>
+        <w:t>Present</w:t>
       </w:r>
       <w:r>
         <w:tab/>
@@ -710,7 +712,7 @@
         <w:rPr>
           <w:lang w:val="en-IN"/>
         </w:rPr>
-        <w:t>, and a </w:t>
+        <w:t xml:space="preserve">, and </w:t>
       </w:r>
       <w:r>
         <w:rPr>
@@ -718,13 +720,31 @@
           <w:bCs/>
           <w:lang w:val="en-IN"/>
         </w:rPr>
-        <w:t>Requirements Traceability Matrix (RTM)</w:t>
+        <w:t>RTM</w:t>
       </w:r>
       <w:r>
         <w:rPr>
           <w:lang w:val="en-IN"/>
         </w:rPr>
-        <w:t> to ensure 100% test coverage for all business requirements.</w:t>
+        <w:t xml:space="preserve"> </w:t>
+      </w:r>
+      <w:r>
+        <w:rPr>
+          <w:lang w:val="en-IN"/>
+        </w:rPr>
+        <w:t xml:space="preserve">to ensure </w:t>
+      </w:r>
+      <w:r>
+        <w:rPr>
+          <w:lang w:val="en-IN"/>
+        </w:rPr>
+        <w:t>full</w:t>
+      </w:r>
+      <w:r>
+        <w:rPr>
+          <w:lang w:val="en-IN"/>
+        </w:rPr>
+        <w:t xml:space="preserve"> test coverage for all business requirements.</w:t>
       </w:r>
     </w:p>
     <w:p>
@@ -846,12 +866,34 @@
         <w:rPr>
           <w:rStyle w:val="NotBold"/>
         </w:rPr>
-        <w:t>March 2022 – Dec 2025</w:t>
+        <w:t>October 2021</w:t>
+      </w:r>
+      <w:r>
+        <w:rPr>
+          <w:rStyle w:val="NotBold"/>
+        </w:rPr>
+        <w:t xml:space="preserve">– </w:t>
+      </w:r>
+      <w:r>
+        <w:rPr>
+          <w:rStyle w:val="NotBold"/>
+        </w:rPr>
+        <w:t>March</w:t>
+      </w:r>
+      <w:r>
+        <w:rPr>
+          <w:rStyle w:val="NotBold"/>
+        </w:rPr>
+        <w:t xml:space="preserve"> </w:t>
+      </w:r>
+      <w:r>
+        <w:rPr>
+          <w:rStyle w:val="NotBold"/>
+        </w:rPr>
+        <w:t>2022</w:t>
       </w:r>
       <w:r>
         <w:tab/>
-      </w:r>
-      <w:r>
         <w:t>Programmer Trainee (QEA)</w:t>
       </w:r>
     </w:p>
@@ -1109,19 +1151,7 @@
         <w:rPr>
           <w:rStyle w:val="NotBold"/>
         </w:rPr>
-        <w:t>June</w:t>
-      </w:r>
-      <w:r>
-        <w:rPr>
-          <w:rStyle w:val="NotBold"/>
-        </w:rPr>
-        <w:t xml:space="preserve"> </w:t>
-      </w:r>
-      <w:r>
-        <w:rPr>
-          <w:rStyle w:val="NotBold"/>
-        </w:rPr>
-        <w:t>2021</w:t>
+        <w:t>June 2021</w:t>
       </w:r>
       <w:r>
         <w:rPr>
@@ -1130,10 +1160,7 @@
         <w:tab/>
       </w:r>
       <w:r>
-        <w:t>Bachelor</w:t>
-      </w:r>
-      <w:r>
-        <w:t xml:space="preserve"> of Computer Applications</w:t>
+        <w:t>Bachelor of Computer Applications</w:t>
       </w:r>
     </w:p>
     <w:p>
@@ -1164,43 +1191,7 @@
           <w:color w:val="000000" w:themeColor="text1"/>
           <w:szCs w:val="24"/>
         </w:rPr>
-        <w:t xml:space="preserve">Completed with </w:t>
-      </w:r>
-      <w:r>
-        <w:rPr>
-          <w:rFonts w:eastAsiaTheme="majorEastAsia" w:cstheme="majorBidi"/>
-          <w:bCs/>
-          <w:color w:val="000000" w:themeColor="text1"/>
-          <w:szCs w:val="24"/>
-        </w:rPr>
-        <w:t>80</w:t>
-      </w:r>
-      <w:r>
-        <w:rPr>
-          <w:rFonts w:eastAsiaTheme="majorEastAsia" w:cstheme="majorBidi"/>
-          <w:bCs/>
-          <w:color w:val="000000" w:themeColor="text1"/>
-          <w:szCs w:val="24"/>
-        </w:rPr>
-        <w:t xml:space="preserve">% </w:t>
-      </w:r>
-      <w:r>
-        <w:rPr>
-          <w:rFonts w:eastAsiaTheme="majorEastAsia" w:cstheme="majorBidi"/>
-          <w:bCs/>
-          <w:color w:val="000000" w:themeColor="text1"/>
-          <w:szCs w:val="24"/>
-        </w:rPr>
-        <w:t>in Regular education (full time)</w:t>
-      </w:r>
-      <w:r>
-        <w:rPr>
-          <w:rFonts w:eastAsiaTheme="majorEastAsia" w:cstheme="majorBidi"/>
-          <w:bCs/>
-          <w:color w:val="000000" w:themeColor="text1"/>
-          <w:szCs w:val="24"/>
-        </w:rPr>
-        <w:t>.</w:t>
+        <w:t>Completed with 80% in Regular education (full time).</w:t>
       </w:r>
     </w:p>
     <w:p>
@@ -1208,7 +1199,6 @@
         <w:pStyle w:val="Heading1"/>
       </w:pPr>
       <w:r>
-        <w:lastRenderedPageBreak/>
         <w:t>Skills &amp; Abilities</w:t>
       </w:r>
     </w:p>
@@ -1281,13 +1271,14 @@
       <w:tblPr>
         <w:tblW w:w="5000" w:type="pct"/>
         <w:tblBorders>
+          <w:insideH w:val="single" w:sz="4" w:space="0" w:color="auto"/>
           <w:insideV w:val="single" w:sz="4" w:space="0" w:color="auto"/>
         </w:tblBorders>
         <w:tblLook w:val="04A0" w:firstRow="1" w:lastRow="0" w:firstColumn="1" w:lastColumn="0" w:noHBand="0" w:noVBand="1"/>
       </w:tblPr>
       <w:tblGrid>
-        <w:gridCol w:w="3199"/>
-        <w:gridCol w:w="6161"/>
+        <w:gridCol w:w="2817"/>
+        <w:gridCol w:w="6543"/>
       </w:tblGrid>
       <w:tr>
         <w:trPr>
@@ -1318,6 +1309,7 @@
                 <w:color w:val="262626"/>
                 <w:lang w:eastAsia="en-IN" w:bidi="ta-IN"/>
               </w:rPr>
+              <w:lastRenderedPageBreak/>
               <w:t>Testing Execution Types</w:t>
             </w:r>
           </w:p>
@@ -1402,7 +1394,23 @@
                 <w:color w:val="000000"/>
                 <w:lang w:val="en-IN" w:eastAsia="en-IN" w:bidi="ta-IN"/>
               </w:rPr>
-              <w:t>STLC (Software Testing Life Cycle)| Waterfall| Agile Methodologies</w:t>
+              <w:t>STLC (Software Testing Life Cycle)| Waterfall</w:t>
+            </w:r>
+            <w:r>
+              <w:rPr>
+                <w:rFonts w:eastAsia="Times New Roman" w:cs="Calibri"/>
+                <w:color w:val="000000"/>
+                <w:lang w:val="en-IN" w:eastAsia="en-IN" w:bidi="ta-IN"/>
+              </w:rPr>
+              <w:t xml:space="preserve"> </w:t>
+            </w:r>
+            <w:r>
+              <w:rPr>
+                <w:rFonts w:eastAsia="Times New Roman" w:cs="Calibri"/>
+                <w:color w:val="000000"/>
+                <w:lang w:val="en-IN" w:eastAsia="en-IN" w:bidi="ta-IN"/>
+              </w:rPr>
+              <w:t xml:space="preserve">| Agile </w:t>
             </w:r>
           </w:p>
         </w:tc>
@@ -2032,7 +2040,7 @@
                 <w:color w:val="262626"/>
                 <w:lang w:eastAsia="en-IN" w:bidi="ta-IN"/>
               </w:rPr>
-              <w:t>Documentation and maintenance</w:t>
+              <w:t>Documentation</w:t>
             </w:r>
           </w:p>
         </w:tc>
@@ -2059,16 +2067,14 @@
               </w:rPr>
               <w:t xml:space="preserve">MS Office (Word| Excel| </w:t>
             </w:r>
-            <w:proofErr w:type="spellStart"/>
             <w:r>
               <w:rPr>
                 <w:rFonts w:eastAsia="Times New Roman" w:cs="Calibri"/>
                 <w:color w:val="000000"/>
                 <w:lang w:val="en-IN" w:eastAsia="en-IN" w:bidi="ta-IN"/>
               </w:rPr>
-              <w:t>Powerpoint</w:t>
+              <w:t>PowerPoint</w:t>
             </w:r>
-            <w:proofErr w:type="spellEnd"/>
             <w:r>
               <w:rPr>
                 <w:rFonts w:eastAsia="Times New Roman" w:cs="Calibri"/>
@@ -2562,7 +2568,27 @@
         <w:rPr>
           <w:lang w:val="en-IN"/>
         </w:rPr>
-        <w:t xml:space="preserve"> WebDriver, </w:t>
+        <w:t xml:space="preserve"> WebDriver</w:t>
+      </w:r>
+      <w:r>
+        <w:rPr>
+          <w:lang w:val="en-IN"/>
+        </w:rPr>
+        <w:t xml:space="preserve"> using </w:t>
+      </w:r>
+      <w:r>
+        <w:rPr>
+          <w:b/>
+          <w:bCs/>
+          <w:lang w:val="en-IN"/>
+        </w:rPr>
+        <w:t>Java</w:t>
+      </w:r>
+      <w:r>
+        <w:rPr>
+          <w:lang w:val="en-IN"/>
+        </w:rPr>
+        <w:t xml:space="preserve">, </w:t>
       </w:r>
       <w:r>
         <w:rPr>
@@ -2814,10 +2840,41 @@
     </w:p>
     <w:p>
       <w:pPr>
+        <w:pStyle w:val="ListBullet"/>
+        <w:numPr>
+          <w:ilvl w:val="0"/>
+          <w:numId w:val="0"/>
+        </w:numPr>
+        <w:spacing w:before="0" w:after="80"/>
+        <w:ind w:left="360" w:hanging="360"/>
+        <w:contextualSpacing w:val="0"/>
+        <w:jc w:val="both"/>
+        <w:rPr>
+          <w:lang w:val="en-IN"/>
+        </w:rPr>
+      </w:pPr>
+    </w:p>
+    <w:p>
+      <w:pPr>
+        <w:pStyle w:val="ListBullet"/>
+        <w:numPr>
+          <w:ilvl w:val="0"/>
+          <w:numId w:val="0"/>
+        </w:numPr>
+        <w:spacing w:before="0" w:after="80"/>
+        <w:ind w:left="360" w:hanging="360"/>
+        <w:contextualSpacing w:val="0"/>
+        <w:jc w:val="both"/>
+        <w:rPr>
+          <w:lang w:val="en-IN"/>
+        </w:rPr>
+      </w:pPr>
+    </w:p>
+    <w:p>
+      <w:pPr>
         <w:pStyle w:val="Heading1"/>
       </w:pPr>
       <w:r>
-        <w:lastRenderedPageBreak/>
         <w:t>COURSE AND CERTIFICATION</w:t>
       </w:r>
     </w:p>
@@ -2898,6 +2955,7 @@
           <w:bCs/>
           <w:lang w:val="en-IN"/>
         </w:rPr>
+        <w:lastRenderedPageBreak/>
         <w:t>Diploma in Web Designing</w:t>
       </w:r>
       <w:r>
@@ -2985,7 +3043,10 @@
         <w:pStyle w:val="Heading1"/>
       </w:pPr>
       <w:r>
-        <w:t>EXTERNAL ACTIVITIES AND ACCOMPLISHMENTS</w:t>
+        <w:t xml:space="preserve">EXTERNAL ACTIVITIES AND </w:t>
+      </w:r>
+      <w:r>
+        <w:t>Contributions</w:t>
       </w:r>
     </w:p>
     <w:p>
@@ -3418,13 +3479,7 @@
         <w:jc w:val="both"/>
       </w:pPr>
       <w:r>
-        <w:t xml:space="preserve">Address: </w:t>
-      </w:r>
-      <w:r>
-        <w:t>98/22, Thandavarayan Street, Old Washermanpet, Chennai-600021</w:t>
-      </w:r>
-      <w:r>
-        <w:t>.</w:t>
+        <w:t>Address: 98/22, Thandavarayan Street, Old Washermanpet, Chennai-600021.</w:t>
       </w:r>
     </w:p>
     <w:p>
@@ -3433,10 +3488,7 @@
         <w:jc w:val="both"/>
       </w:pPr>
       <w:r>
-        <w:t xml:space="preserve">Phone number: </w:t>
-      </w:r>
-      <w:r>
-        <w:t xml:space="preserve">+91 7358512884 | </w:t>
+        <w:t xml:space="preserve">Phone number: +91 7358512884 | </w:t>
       </w:r>
     </w:p>
     <w:p>
@@ -3445,10 +3497,7 @@
         <w:jc w:val="both"/>
       </w:pPr>
       <w:r>
-        <w:t xml:space="preserve">Email: </w:t>
-      </w:r>
-      <w:r>
-        <w:t xml:space="preserve">haryishkumaran16@gmail.com </w:t>
+        <w:t xml:space="preserve">Email: haryishkumaran16@gmail.com </w:t>
       </w:r>
     </w:p>
     <w:p>
@@ -6232,6 +6281,7 @@
   <w:style w:type="character" w:default="1" w:styleId="DefaultParagraphFont">
     <w:name w:val="Default Paragraph Font"/>
     <w:uiPriority w:val="1"/>
+    <w:semiHidden/>
     <w:unhideWhenUsed/>
   </w:style>
   <w:style w:type="table" w:default="1" w:styleId="TableNormal">
@@ -31167,9 +31217,11 @@
     <w:rsid w:val="004C04F3"/>
     <w:rsid w:val="00592E7B"/>
     <w:rsid w:val="00647800"/>
+    <w:rsid w:val="00924A96"/>
     <w:rsid w:val="0097644A"/>
     <w:rsid w:val="00BB7F9F"/>
     <w:rsid w:val="00BC22DC"/>
+    <w:rsid w:val="00BE541F"/>
     <w:rsid w:val="00C9000E"/>
     <w:rsid w:val="00D31FBD"/>
     <w:rsid w:val="00DF4FB3"/>
@@ -31647,56 +31699,6 @@
     <w:semiHidden/>
     <w:unhideWhenUsed/>
   </w:style>
-  <w:style w:type="paragraph" w:customStyle="1" w:styleId="7BE8B446E60749AAAF856AB53AB31114">
-    <w:name w:val="7BE8B446E60749AAAF856AB53AB31114"/>
-  </w:style>
-  <w:style w:type="paragraph" w:customStyle="1" w:styleId="A0A813F57E904789AB89493B72B6E667">
-    <w:name w:val="A0A813F57E904789AB89493B72B6E667"/>
-  </w:style>
-  <w:style w:type="paragraph" w:customStyle="1" w:styleId="392779414D544F9D9629BCF6B679AC5B">
-    <w:name w:val="392779414D544F9D9629BCF6B679AC5B"/>
-  </w:style>
-  <w:style w:type="paragraph" w:customStyle="1" w:styleId="311957413FCD45C5A254556B03E74E03">
-    <w:name w:val="311957413FCD45C5A254556B03E74E03"/>
-  </w:style>
-  <w:style w:type="paragraph" w:customStyle="1" w:styleId="24B5CE5FC2B24B748F67E7867FFA099F">
-    <w:name w:val="24B5CE5FC2B24B748F67E7867FFA099F"/>
-  </w:style>
-  <w:style w:type="paragraph" w:customStyle="1" w:styleId="96561C2EBCC04E50A4EF921E1C4463F6">
-    <w:name w:val="96561C2EBCC04E50A4EF921E1C4463F6"/>
-    <w:rsid w:val="00C9000E"/>
-    <w:rPr>
-      <w:lang w:val="en-AU" w:eastAsia="en-AU"/>
-    </w:rPr>
-  </w:style>
-  <w:style w:type="paragraph" w:customStyle="1" w:styleId="6BD038FB90854A58BA3F52F9E6BC0292">
-    <w:name w:val="6BD038FB90854A58BA3F52F9E6BC0292"/>
-    <w:rsid w:val="00C9000E"/>
-    <w:rPr>
-      <w:lang w:val="en-AU" w:eastAsia="en-AU"/>
-    </w:rPr>
-  </w:style>
-  <w:style w:type="paragraph" w:customStyle="1" w:styleId="F025BF7CF7CA49368241DBCCEB30B6E0">
-    <w:name w:val="F025BF7CF7CA49368241DBCCEB30B6E0"/>
-    <w:rsid w:val="00C9000E"/>
-    <w:rPr>
-      <w:lang w:val="en-AU" w:eastAsia="en-AU"/>
-    </w:rPr>
-  </w:style>
-  <w:style w:type="paragraph" w:customStyle="1" w:styleId="F2B5D0419C95482BA76281A02AB8088F">
-    <w:name w:val="F2B5D0419C95482BA76281A02AB8088F"/>
-    <w:rsid w:val="00C9000E"/>
-    <w:rPr>
-      <w:lang w:val="en-AU" w:eastAsia="en-AU"/>
-    </w:rPr>
-  </w:style>
-  <w:style w:type="paragraph" w:customStyle="1" w:styleId="30307CBCF1284C30A4001E11DB19006D">
-    <w:name w:val="30307CBCF1284C30A4001E11DB19006D"/>
-    <w:rsid w:val="00C9000E"/>
-    <w:rPr>
-      <w:lang w:val="en-AU" w:eastAsia="en-AU"/>
-    </w:rPr>
-  </w:style>
   <w:style w:type="character" w:styleId="PlaceholderText">
     <w:name w:val="Placeholder Text"/>
     <w:basedOn w:val="DefaultParagraphFont"/>
@@ -31707,97 +31709,6 @@
       <w:color w:val="595959" w:themeColor="text1" w:themeTint="A6"/>
     </w:rPr>
   </w:style>
-  <w:style w:type="paragraph" w:customStyle="1" w:styleId="2AB0CA6BD43B4C81B540CB2D960A9927">
-    <w:name w:val="2AB0CA6BD43B4C81B540CB2D960A9927"/>
-    <w:rsid w:val="00C9000E"/>
-    <w:rPr>
-      <w:lang w:val="en-AU" w:eastAsia="en-AU"/>
-    </w:rPr>
-  </w:style>
-  <w:style w:type="paragraph" w:customStyle="1" w:styleId="6E83DBD206414BD88ECD3DECF483BE1F">
-    <w:name w:val="6E83DBD206414BD88ECD3DECF483BE1F"/>
-    <w:rsid w:val="00C9000E"/>
-    <w:pPr>
-      <w:spacing w:after="0" w:line="240" w:lineRule="auto"/>
-    </w:pPr>
-    <w:rPr>
-      <w:rFonts w:ascii="Calibri" w:hAnsi="Calibri"/>
-      <w:color w:val="262626" w:themeColor="text1" w:themeTint="D9"/>
-      <w:lang w:eastAsia="ja-JP"/>
-    </w:rPr>
-  </w:style>
-  <w:style w:type="paragraph" w:customStyle="1" w:styleId="14ECEE85504B445B824149407E01A6A2">
-    <w:name w:val="14ECEE85504B445B824149407E01A6A2"/>
-    <w:rsid w:val="00592E7B"/>
-    <w:rPr>
-      <w:kern w:val="2"/>
-      <w14:ligatures w14:val="standardContextual"/>
-    </w:rPr>
-  </w:style>
-  <w:style w:type="paragraph" w:customStyle="1" w:styleId="510C86CB32F146B5B9D0B419AF0BB398">
-    <w:name w:val="510C86CB32F146B5B9D0B419AF0BB398"/>
-    <w:rsid w:val="00592E7B"/>
-    <w:rPr>
-      <w:kern w:val="2"/>
-      <w14:ligatures w14:val="standardContextual"/>
-    </w:rPr>
-  </w:style>
-  <w:style w:type="paragraph" w:customStyle="1" w:styleId="EB2A164ABB9945749B6811CAA0D76071">
-    <w:name w:val="EB2A164ABB9945749B6811CAA0D76071"/>
-    <w:rsid w:val="00592E7B"/>
-    <w:rPr>
-      <w:kern w:val="2"/>
-      <w14:ligatures w14:val="standardContextual"/>
-    </w:rPr>
-  </w:style>
-  <w:style w:type="paragraph" w:customStyle="1" w:styleId="2E8CEAF3EE484129AF3837D95B86C70F">
-    <w:name w:val="2E8CEAF3EE484129AF3837D95B86C70F"/>
-    <w:rsid w:val="00592E7B"/>
-    <w:rPr>
-      <w:kern w:val="2"/>
-      <w14:ligatures w14:val="standardContextual"/>
-    </w:rPr>
-  </w:style>
-  <w:style w:type="paragraph" w:customStyle="1" w:styleId="E428B2FB69C44D5C99DF6B83581E2184">
-    <w:name w:val="E428B2FB69C44D5C99DF6B83581E2184"/>
-    <w:rsid w:val="00592E7B"/>
-    <w:rPr>
-      <w:kern w:val="2"/>
-      <w14:ligatures w14:val="standardContextual"/>
-    </w:rPr>
-  </w:style>
-  <w:style w:type="paragraph" w:customStyle="1" w:styleId="00E600B9EFC545EDA951D725A2FE6CA2">
-    <w:name w:val="00E600B9EFC545EDA951D725A2FE6CA2"/>
-    <w:rsid w:val="00592E7B"/>
-    <w:rPr>
-      <w:kern w:val="2"/>
-      <w14:ligatures w14:val="standardContextual"/>
-    </w:rPr>
-  </w:style>
-  <w:style w:type="paragraph" w:customStyle="1" w:styleId="73C1B0E9964747B5BD88BE9A69C649FB">
-    <w:name w:val="73C1B0E9964747B5BD88BE9A69C649FB"/>
-    <w:rsid w:val="00592E7B"/>
-    <w:rPr>
-      <w:kern w:val="2"/>
-      <w14:ligatures w14:val="standardContextual"/>
-    </w:rPr>
-  </w:style>
-  <w:style w:type="paragraph" w:customStyle="1" w:styleId="16EF1D77E15A458887E417EB363F0D83">
-    <w:name w:val="16EF1D77E15A458887E417EB363F0D83"/>
-    <w:rsid w:val="00592E7B"/>
-    <w:rPr>
-      <w:kern w:val="2"/>
-      <w14:ligatures w14:val="standardContextual"/>
-    </w:rPr>
-  </w:style>
-  <w:style w:type="paragraph" w:customStyle="1" w:styleId="0D7AF0061A3F4CF9A06C6E016D1CD756">
-    <w:name w:val="0D7AF0061A3F4CF9A06C6E016D1CD756"/>
-    <w:rsid w:val="00592E7B"/>
-    <w:rPr>
-      <w:kern w:val="2"/>
-      <w14:ligatures w14:val="standardContextual"/>
-    </w:rPr>
-  </w:style>
   <w:style w:type="paragraph" w:customStyle="1" w:styleId="A9B4AF3FE9284261BBC637E0901AD7F0">
     <w:name w:val="A9B4AF3FE9284261BBC637E0901AD7F0"/>
     <w:rsid w:val="00592E7B"/>
@@ -31806,136 +31717,8 @@
       <w14:ligatures w14:val="standardContextual"/>
     </w:rPr>
   </w:style>
-  <w:style w:type="paragraph" w:customStyle="1" w:styleId="A000F6DCE41F47D58E7CE116A6949B20">
-    <w:name w:val="A000F6DCE41F47D58E7CE116A6949B20"/>
-    <w:rsid w:val="00592E7B"/>
-    <w:rPr>
-      <w:kern w:val="2"/>
-      <w14:ligatures w14:val="standardContextual"/>
-    </w:rPr>
-  </w:style>
-  <w:style w:type="paragraph" w:customStyle="1" w:styleId="8D819033F4844AD3943695A55AD5FA57">
-    <w:name w:val="8D819033F4844AD3943695A55AD5FA57"/>
-    <w:rsid w:val="00592E7B"/>
-    <w:rPr>
-      <w:kern w:val="2"/>
-      <w14:ligatures w14:val="standardContextual"/>
-    </w:rPr>
-  </w:style>
-  <w:style w:type="paragraph" w:customStyle="1" w:styleId="45EC1B5C73404CD0A749CD7FB8ADD051">
-    <w:name w:val="45EC1B5C73404CD0A749CD7FB8ADD051"/>
-    <w:rsid w:val="00592E7B"/>
-    <w:rPr>
-      <w:kern w:val="2"/>
-      <w14:ligatures w14:val="standardContextual"/>
-    </w:rPr>
-  </w:style>
-  <w:style w:type="paragraph" w:customStyle="1" w:styleId="A4282D6A6D174582A6E704B57AF0533E">
-    <w:name w:val="A4282D6A6D174582A6E704B57AF0533E"/>
-    <w:rsid w:val="00592E7B"/>
-    <w:rPr>
-      <w:kern w:val="2"/>
-      <w14:ligatures w14:val="standardContextual"/>
-    </w:rPr>
-  </w:style>
-  <w:style w:type="paragraph" w:customStyle="1" w:styleId="B78ADF525D764A02ABD964D5C50568B4">
-    <w:name w:val="B78ADF525D764A02ABD964D5C50568B4"/>
-    <w:rsid w:val="00592E7B"/>
-    <w:rPr>
-      <w:kern w:val="2"/>
-      <w14:ligatures w14:val="standardContextual"/>
-    </w:rPr>
-  </w:style>
-  <w:style w:type="paragraph" w:customStyle="1" w:styleId="AD430E8DFE6A47EFBB51CFBA7BF8FBDA">
-    <w:name w:val="AD430E8DFE6A47EFBB51CFBA7BF8FBDA"/>
-    <w:rsid w:val="00592E7B"/>
-    <w:rPr>
-      <w:kern w:val="2"/>
-      <w14:ligatures w14:val="standardContextual"/>
-    </w:rPr>
-  </w:style>
-  <w:style w:type="paragraph" w:customStyle="1" w:styleId="6D3F3136E357464DB891F495BEC7C62C">
-    <w:name w:val="6D3F3136E357464DB891F495BEC7C62C"/>
-    <w:rsid w:val="00592E7B"/>
-    <w:rPr>
-      <w:kern w:val="2"/>
-      <w14:ligatures w14:val="standardContextual"/>
-    </w:rPr>
-  </w:style>
-  <w:style w:type="paragraph" w:customStyle="1" w:styleId="FE42D19B558C4D608377847D6A20D6F5">
-    <w:name w:val="FE42D19B558C4D608377847D6A20D6F5"/>
-    <w:rsid w:val="00592E7B"/>
-    <w:rPr>
-      <w:kern w:val="2"/>
-      <w14:ligatures w14:val="standardContextual"/>
-    </w:rPr>
-  </w:style>
   <w:style w:type="paragraph" w:customStyle="1" w:styleId="AB163E7F5DBB415B875F0BE5BD032FBE">
     <w:name w:val="AB163E7F5DBB415B875F0BE5BD032FBE"/>
-    <w:rsid w:val="00592E7B"/>
-    <w:rPr>
-      <w:kern w:val="2"/>
-      <w14:ligatures w14:val="standardContextual"/>
-    </w:rPr>
-  </w:style>
-  <w:style w:type="paragraph" w:customStyle="1" w:styleId="1A09C74938B54B9283D1BF17D2C2B863">
-    <w:name w:val="1A09C74938B54B9283D1BF17D2C2B863"/>
-    <w:rsid w:val="00592E7B"/>
-    <w:rPr>
-      <w:kern w:val="2"/>
-      <w14:ligatures w14:val="standardContextual"/>
-    </w:rPr>
-  </w:style>
-  <w:style w:type="paragraph" w:customStyle="1" w:styleId="4E6CBCF4A9064F1CAD5EAF45C0EB9400">
-    <w:name w:val="4E6CBCF4A9064F1CAD5EAF45C0EB9400"/>
-    <w:rsid w:val="00592E7B"/>
-    <w:rPr>
-      <w:kern w:val="2"/>
-      <w14:ligatures w14:val="standardContextual"/>
-    </w:rPr>
-  </w:style>
-  <w:style w:type="paragraph" w:customStyle="1" w:styleId="617ED4EC0625476D8105AF94B12FE751">
-    <w:name w:val="617ED4EC0625476D8105AF94B12FE751"/>
-    <w:rsid w:val="00592E7B"/>
-    <w:rPr>
-      <w:kern w:val="2"/>
-      <w14:ligatures w14:val="standardContextual"/>
-    </w:rPr>
-  </w:style>
-  <w:style w:type="paragraph" w:customStyle="1" w:styleId="CAFE53DC2DD44B5CA5F9ED9545AAB95D">
-    <w:name w:val="CAFE53DC2DD44B5CA5F9ED9545AAB95D"/>
-    <w:rsid w:val="00592E7B"/>
-    <w:rPr>
-      <w:kern w:val="2"/>
-      <w14:ligatures w14:val="standardContextual"/>
-    </w:rPr>
-  </w:style>
-  <w:style w:type="paragraph" w:customStyle="1" w:styleId="35F7ACE96B5F421CA0238219EAD6BC17">
-    <w:name w:val="35F7ACE96B5F421CA0238219EAD6BC17"/>
-    <w:rsid w:val="00592E7B"/>
-    <w:rPr>
-      <w:kern w:val="2"/>
-      <w14:ligatures w14:val="standardContextual"/>
-    </w:rPr>
-  </w:style>
-  <w:style w:type="paragraph" w:customStyle="1" w:styleId="0BCC48D3681E40B4A97CCCD10C776EB5">
-    <w:name w:val="0BCC48D3681E40B4A97CCCD10C776EB5"/>
-    <w:rsid w:val="00592E7B"/>
-    <w:rPr>
-      <w:kern w:val="2"/>
-      <w14:ligatures w14:val="standardContextual"/>
-    </w:rPr>
-  </w:style>
-  <w:style w:type="paragraph" w:customStyle="1" w:styleId="3300306457C94D739C4DB046D4CD2B5C">
-    <w:name w:val="3300306457C94D739C4DB046D4CD2B5C"/>
-    <w:rsid w:val="00592E7B"/>
-    <w:rPr>
-      <w:kern w:val="2"/>
-      <w14:ligatures w14:val="standardContextual"/>
-    </w:rPr>
-  </w:style>
-  <w:style w:type="paragraph" w:customStyle="1" w:styleId="2827B5ADD4C546109CE7C961D1337582">
-    <w:name w:val="2827B5ADD4C546109CE7C961D1337582"/>
     <w:rsid w:val="00592E7B"/>
     <w:rPr>
       <w:kern w:val="2"/>
@@ -31955,503 +31738,6 @@
       <w:spacing w:val="10"/>
       <w:szCs w:val="28"/>
       <w:lang w:eastAsia="ja-JP"/>
-    </w:rPr>
-  </w:style>
-  <w:style w:type="paragraph" w:customStyle="1" w:styleId="35F7ACE96B5F421CA0238219EAD6BC171">
-    <w:name w:val="35F7ACE96B5F421CA0238219EAD6BC171"/>
-    <w:rsid w:val="00592E7B"/>
-    <w:pPr>
-      <w:keepNext/>
-      <w:keepLines/>
-      <w:spacing w:before="120" w:after="0" w:line="240" w:lineRule="auto"/>
-      <w:outlineLvl w:val="0"/>
-    </w:pPr>
-    <w:rPr>
-      <w:rFonts w:asciiTheme="majorHAnsi" w:eastAsiaTheme="majorEastAsia" w:hAnsiTheme="majorHAnsi" w:cs="Tahoma (Headings CS)"/>
-      <w:caps/>
-      <w:color w:val="000000" w:themeColor="text1"/>
-      <w:spacing w:val="10"/>
-      <w:szCs w:val="28"/>
-      <w:lang w:eastAsia="ja-JP"/>
-    </w:rPr>
-  </w:style>
-  <w:style w:type="paragraph" w:customStyle="1" w:styleId="35F7ACE96B5F421CA0238219EAD6BC172">
-    <w:name w:val="35F7ACE96B5F421CA0238219EAD6BC172"/>
-    <w:rsid w:val="00592E7B"/>
-    <w:pPr>
-      <w:keepNext/>
-      <w:keepLines/>
-      <w:spacing w:before="120" w:after="0" w:line="240" w:lineRule="auto"/>
-      <w:outlineLvl w:val="0"/>
-    </w:pPr>
-    <w:rPr>
-      <w:rFonts w:asciiTheme="majorHAnsi" w:eastAsiaTheme="majorEastAsia" w:hAnsiTheme="majorHAnsi" w:cs="Tahoma (Headings CS)"/>
-      <w:caps/>
-      <w:color w:val="000000" w:themeColor="text1"/>
-      <w:spacing w:val="10"/>
-      <w:szCs w:val="28"/>
-      <w:lang w:eastAsia="ja-JP"/>
-    </w:rPr>
-  </w:style>
-  <w:style w:type="character" w:customStyle="1" w:styleId="NotBold">
-    <w:name w:val="Not Bold"/>
-    <w:uiPriority w:val="1"/>
-    <w:qFormat/>
-    <w:rsid w:val="00F01FC2"/>
-    <w:rPr>
-      <w:b/>
-    </w:rPr>
-  </w:style>
-  <w:style w:type="paragraph" w:customStyle="1" w:styleId="A000F6DCE41F47D58E7CE116A6949B201">
-    <w:name w:val="A000F6DCE41F47D58E7CE116A6949B201"/>
-    <w:rsid w:val="00592E7B"/>
-    <w:pPr>
-      <w:keepNext/>
-      <w:keepLines/>
-      <w:tabs>
-        <w:tab w:val="left" w:pos="2794"/>
-      </w:tabs>
-      <w:spacing w:before="120" w:after="0" w:line="240" w:lineRule="auto"/>
-      <w:outlineLvl w:val="1"/>
-    </w:pPr>
-    <w:rPr>
-      <w:rFonts w:ascii="Calibri" w:eastAsiaTheme="majorEastAsia" w:hAnsi="Calibri" w:cstheme="majorBidi"/>
-      <w:b/>
-      <w:color w:val="000000" w:themeColor="text1"/>
-      <w:szCs w:val="24"/>
-      <w:lang w:eastAsia="ja-JP"/>
-    </w:rPr>
-  </w:style>
-  <w:style w:type="paragraph" w:customStyle="1" w:styleId="B78ADF525D764A02ABD964D5C50568B41">
-    <w:name w:val="B78ADF525D764A02ABD964D5C50568B41"/>
-    <w:rsid w:val="00592E7B"/>
-    <w:pPr>
-      <w:keepNext/>
-      <w:keepLines/>
-      <w:tabs>
-        <w:tab w:val="left" w:pos="2794"/>
-      </w:tabs>
-      <w:spacing w:before="120" w:after="0" w:line="240" w:lineRule="auto"/>
-      <w:outlineLvl w:val="1"/>
-    </w:pPr>
-    <w:rPr>
-      <w:rFonts w:ascii="Calibri" w:eastAsiaTheme="majorEastAsia" w:hAnsi="Calibri" w:cstheme="majorBidi"/>
-      <w:b/>
-      <w:color w:val="000000" w:themeColor="text1"/>
-      <w:szCs w:val="24"/>
-      <w:lang w:eastAsia="ja-JP"/>
-    </w:rPr>
-  </w:style>
-  <w:style w:type="paragraph" w:customStyle="1" w:styleId="1A09C74938B54B9283D1BF17D2C2B8631">
-    <w:name w:val="1A09C74938B54B9283D1BF17D2C2B8631"/>
-    <w:rsid w:val="00592E7B"/>
-    <w:pPr>
-      <w:keepNext/>
-      <w:keepLines/>
-      <w:tabs>
-        <w:tab w:val="left" w:pos="2794"/>
-      </w:tabs>
-      <w:spacing w:before="120" w:after="0" w:line="240" w:lineRule="auto"/>
-      <w:outlineLvl w:val="1"/>
-    </w:pPr>
-    <w:rPr>
-      <w:rFonts w:ascii="Calibri" w:eastAsiaTheme="majorEastAsia" w:hAnsi="Calibri" w:cstheme="majorBidi"/>
-      <w:b/>
-      <w:color w:val="000000" w:themeColor="text1"/>
-      <w:szCs w:val="24"/>
-      <w:lang w:eastAsia="ja-JP"/>
-    </w:rPr>
-  </w:style>
-  <w:style w:type="paragraph" w:customStyle="1" w:styleId="35F7ACE96B5F421CA0238219EAD6BC173">
-    <w:name w:val="35F7ACE96B5F421CA0238219EAD6BC173"/>
-    <w:rsid w:val="00592E7B"/>
-    <w:pPr>
-      <w:keepNext/>
-      <w:keepLines/>
-      <w:spacing w:before="120" w:after="0" w:line="240" w:lineRule="auto"/>
-      <w:outlineLvl w:val="0"/>
-    </w:pPr>
-    <w:rPr>
-      <w:rFonts w:asciiTheme="majorHAnsi" w:eastAsiaTheme="majorEastAsia" w:hAnsiTheme="majorHAnsi" w:cs="Tahoma (Headings CS)"/>
-      <w:caps/>
-      <w:color w:val="000000" w:themeColor="text1"/>
-      <w:spacing w:val="10"/>
-      <w:szCs w:val="28"/>
-      <w:lang w:eastAsia="ja-JP"/>
-    </w:rPr>
-  </w:style>
-  <w:style w:type="paragraph" w:customStyle="1" w:styleId="A000F6DCE41F47D58E7CE116A6949B202">
-    <w:name w:val="A000F6DCE41F47D58E7CE116A6949B202"/>
-    <w:rsid w:val="001B3AB2"/>
-    <w:pPr>
-      <w:keepNext/>
-      <w:keepLines/>
-      <w:tabs>
-        <w:tab w:val="left" w:pos="2794"/>
-      </w:tabs>
-      <w:spacing w:before="120" w:after="0" w:line="240" w:lineRule="auto"/>
-      <w:outlineLvl w:val="1"/>
-    </w:pPr>
-    <w:rPr>
-      <w:rFonts w:ascii="Calibri" w:eastAsiaTheme="majorEastAsia" w:hAnsi="Calibri" w:cstheme="majorBidi"/>
-      <w:b/>
-      <w:color w:val="000000" w:themeColor="text1"/>
-      <w:szCs w:val="24"/>
-      <w:lang w:eastAsia="ja-JP"/>
-    </w:rPr>
-  </w:style>
-  <w:style w:type="paragraph" w:customStyle="1" w:styleId="B78ADF525D764A02ABD964D5C50568B42">
-    <w:name w:val="B78ADF525D764A02ABD964D5C50568B42"/>
-    <w:rsid w:val="001B3AB2"/>
-    <w:pPr>
-      <w:keepNext/>
-      <w:keepLines/>
-      <w:tabs>
-        <w:tab w:val="left" w:pos="2794"/>
-      </w:tabs>
-      <w:spacing w:before="120" w:after="0" w:line="240" w:lineRule="auto"/>
-      <w:outlineLvl w:val="1"/>
-    </w:pPr>
-    <w:rPr>
-      <w:rFonts w:ascii="Calibri" w:eastAsiaTheme="majorEastAsia" w:hAnsi="Calibri" w:cstheme="majorBidi"/>
-      <w:b/>
-      <w:color w:val="000000" w:themeColor="text1"/>
-      <w:szCs w:val="24"/>
-      <w:lang w:eastAsia="ja-JP"/>
-    </w:rPr>
-  </w:style>
-  <w:style w:type="paragraph" w:customStyle="1" w:styleId="1A09C74938B54B9283D1BF17D2C2B8632">
-    <w:name w:val="1A09C74938B54B9283D1BF17D2C2B8632"/>
-    <w:rsid w:val="001B3AB2"/>
-    <w:pPr>
-      <w:keepNext/>
-      <w:keepLines/>
-      <w:tabs>
-        <w:tab w:val="left" w:pos="2794"/>
-      </w:tabs>
-      <w:spacing w:before="120" w:after="0" w:line="240" w:lineRule="auto"/>
-      <w:outlineLvl w:val="1"/>
-    </w:pPr>
-    <w:rPr>
-      <w:rFonts w:ascii="Calibri" w:eastAsiaTheme="majorEastAsia" w:hAnsi="Calibri" w:cstheme="majorBidi"/>
-      <w:b/>
-      <w:color w:val="000000" w:themeColor="text1"/>
-      <w:szCs w:val="24"/>
-      <w:lang w:eastAsia="ja-JP"/>
-    </w:rPr>
-  </w:style>
-  <w:style w:type="paragraph" w:customStyle="1" w:styleId="35F7ACE96B5F421CA0238219EAD6BC174">
-    <w:name w:val="35F7ACE96B5F421CA0238219EAD6BC174"/>
-    <w:rsid w:val="001B3AB2"/>
-    <w:pPr>
-      <w:keepNext/>
-      <w:keepLines/>
-      <w:spacing w:before="120" w:after="0" w:line="240" w:lineRule="auto"/>
-      <w:outlineLvl w:val="0"/>
-    </w:pPr>
-    <w:rPr>
-      <w:rFonts w:asciiTheme="majorHAnsi" w:eastAsiaTheme="majorEastAsia" w:hAnsiTheme="majorHAnsi" w:cs="Tahoma (Headings CS)"/>
-      <w:caps/>
-      <w:color w:val="000000" w:themeColor="text1"/>
-      <w:spacing w:val="10"/>
-      <w:szCs w:val="28"/>
-      <w:lang w:eastAsia="ja-JP"/>
-    </w:rPr>
-  </w:style>
-  <w:style w:type="paragraph" w:customStyle="1" w:styleId="2E8CEAF3EE484129AF3837D95B86C70F1">
-    <w:name w:val="2E8CEAF3EE484129AF3837D95B86C70F1"/>
-    <w:rsid w:val="00DF4FB3"/>
-    <w:pPr>
-      <w:spacing w:after="0" w:line="240" w:lineRule="auto"/>
-      <w:jc w:val="right"/>
-    </w:pPr>
-    <w:rPr>
-      <w:rFonts w:cs="Tahoma (Body CS)"/>
-      <w:caps/>
-      <w:color w:val="000000" w:themeColor="text1"/>
-      <w:spacing w:val="10"/>
-      <w:szCs w:val="20"/>
-      <w:lang w:eastAsia="ja-JP"/>
-    </w:rPr>
-  </w:style>
-  <w:style w:type="paragraph" w:customStyle="1" w:styleId="E428B2FB69C44D5C99DF6B83581E21841">
-    <w:name w:val="E428B2FB69C44D5C99DF6B83581E21841"/>
-    <w:rsid w:val="00DF4FB3"/>
-    <w:pPr>
-      <w:spacing w:after="0" w:line="240" w:lineRule="auto"/>
-      <w:jc w:val="right"/>
-    </w:pPr>
-    <w:rPr>
-      <w:rFonts w:cs="Tahoma (Body CS)"/>
-      <w:caps/>
-      <w:color w:val="000000" w:themeColor="text1"/>
-      <w:spacing w:val="10"/>
-      <w:szCs w:val="20"/>
-      <w:lang w:eastAsia="ja-JP"/>
-    </w:rPr>
-  </w:style>
-  <w:style w:type="paragraph" w:customStyle="1" w:styleId="00E600B9EFC545EDA951D725A2FE6CA21">
-    <w:name w:val="00E600B9EFC545EDA951D725A2FE6CA21"/>
-    <w:rsid w:val="00DF4FB3"/>
-    <w:pPr>
-      <w:keepNext/>
-      <w:keepLines/>
-      <w:spacing w:before="120" w:after="0" w:line="240" w:lineRule="auto"/>
-      <w:outlineLvl w:val="0"/>
-    </w:pPr>
-    <w:rPr>
-      <w:rFonts w:asciiTheme="majorHAnsi" w:eastAsiaTheme="majorEastAsia" w:hAnsiTheme="majorHAnsi" w:cs="Tahoma (Headings CS)"/>
-      <w:caps/>
-      <w:color w:val="000000" w:themeColor="text1"/>
-      <w:spacing w:val="10"/>
-      <w:szCs w:val="28"/>
-      <w:lang w:eastAsia="ja-JP"/>
-    </w:rPr>
-  </w:style>
-  <w:style w:type="paragraph" w:customStyle="1" w:styleId="A000F6DCE41F47D58E7CE116A6949B203">
-    <w:name w:val="A000F6DCE41F47D58E7CE116A6949B203"/>
-    <w:rsid w:val="00DF4FB3"/>
-    <w:pPr>
-      <w:keepNext/>
-      <w:keepLines/>
-      <w:tabs>
-        <w:tab w:val="left" w:pos="2794"/>
-      </w:tabs>
-      <w:spacing w:before="120" w:after="0" w:line="240" w:lineRule="auto"/>
-      <w:outlineLvl w:val="1"/>
-    </w:pPr>
-    <w:rPr>
-      <w:rFonts w:ascii="Calibri" w:eastAsiaTheme="majorEastAsia" w:hAnsi="Calibri" w:cstheme="majorBidi"/>
-      <w:b/>
-      <w:color w:val="000000" w:themeColor="text1"/>
-      <w:szCs w:val="24"/>
-      <w:lang w:eastAsia="ja-JP"/>
-    </w:rPr>
-  </w:style>
-  <w:style w:type="paragraph" w:customStyle="1" w:styleId="B78ADF525D764A02ABD964D5C50568B43">
-    <w:name w:val="B78ADF525D764A02ABD964D5C50568B43"/>
-    <w:rsid w:val="00DF4FB3"/>
-    <w:pPr>
-      <w:keepNext/>
-      <w:keepLines/>
-      <w:tabs>
-        <w:tab w:val="left" w:pos="2794"/>
-      </w:tabs>
-      <w:spacing w:before="120" w:after="0" w:line="240" w:lineRule="auto"/>
-      <w:outlineLvl w:val="1"/>
-    </w:pPr>
-    <w:rPr>
-      <w:rFonts w:ascii="Calibri" w:eastAsiaTheme="majorEastAsia" w:hAnsi="Calibri" w:cstheme="majorBidi"/>
-      <w:b/>
-      <w:color w:val="000000" w:themeColor="text1"/>
-      <w:szCs w:val="24"/>
-      <w:lang w:eastAsia="ja-JP"/>
-    </w:rPr>
-  </w:style>
-  <w:style w:type="paragraph" w:customStyle="1" w:styleId="1A09C74938B54B9283D1BF17D2C2B8633">
-    <w:name w:val="1A09C74938B54B9283D1BF17D2C2B8633"/>
-    <w:rsid w:val="00DF4FB3"/>
-    <w:pPr>
-      <w:keepNext/>
-      <w:keepLines/>
-      <w:tabs>
-        <w:tab w:val="left" w:pos="2794"/>
-      </w:tabs>
-      <w:spacing w:before="120" w:after="0" w:line="240" w:lineRule="auto"/>
-      <w:outlineLvl w:val="1"/>
-    </w:pPr>
-    <w:rPr>
-      <w:rFonts w:ascii="Calibri" w:eastAsiaTheme="majorEastAsia" w:hAnsi="Calibri" w:cstheme="majorBidi"/>
-      <w:b/>
-      <w:color w:val="000000" w:themeColor="text1"/>
-      <w:szCs w:val="24"/>
-      <w:lang w:eastAsia="ja-JP"/>
-    </w:rPr>
-  </w:style>
-  <w:style w:type="paragraph" w:customStyle="1" w:styleId="35F7ACE96B5F421CA0238219EAD6BC175">
-    <w:name w:val="35F7ACE96B5F421CA0238219EAD6BC175"/>
-    <w:rsid w:val="00DF4FB3"/>
-    <w:pPr>
-      <w:keepNext/>
-      <w:keepLines/>
-      <w:spacing w:before="120" w:after="0" w:line="240" w:lineRule="auto"/>
-      <w:outlineLvl w:val="0"/>
-    </w:pPr>
-    <w:rPr>
-      <w:rFonts w:asciiTheme="majorHAnsi" w:eastAsiaTheme="majorEastAsia" w:hAnsiTheme="majorHAnsi" w:cs="Tahoma (Headings CS)"/>
-      <w:caps/>
-      <w:color w:val="000000" w:themeColor="text1"/>
-      <w:spacing w:val="10"/>
-      <w:szCs w:val="28"/>
-      <w:lang w:eastAsia="ja-JP"/>
-    </w:rPr>
-  </w:style>
-  <w:style w:type="paragraph" w:customStyle="1" w:styleId="E428B2FB69C44D5C99DF6B83581E21842">
-    <w:name w:val="E428B2FB69C44D5C99DF6B83581E21842"/>
-    <w:rsid w:val="00F01FC2"/>
-    <w:pPr>
-      <w:spacing w:after="0" w:line="240" w:lineRule="auto"/>
-      <w:jc w:val="right"/>
-    </w:pPr>
-    <w:rPr>
-      <w:rFonts w:cs="Tahoma (Body CS)"/>
-      <w:caps/>
-      <w:color w:val="000000" w:themeColor="text1"/>
-      <w:spacing w:val="10"/>
-      <w:szCs w:val="20"/>
-      <w:lang w:eastAsia="ja-JP"/>
-    </w:rPr>
-  </w:style>
-  <w:style w:type="paragraph" w:customStyle="1" w:styleId="00E600B9EFC545EDA951D725A2FE6CA22">
-    <w:name w:val="00E600B9EFC545EDA951D725A2FE6CA22"/>
-    <w:rsid w:val="00F01FC2"/>
-    <w:pPr>
-      <w:keepNext/>
-      <w:keepLines/>
-      <w:spacing w:before="120" w:after="0" w:line="240" w:lineRule="auto"/>
-      <w:outlineLvl w:val="0"/>
-    </w:pPr>
-    <w:rPr>
-      <w:rFonts w:asciiTheme="majorHAnsi" w:eastAsiaTheme="majorEastAsia" w:hAnsiTheme="majorHAnsi" w:cs="Tahoma (Headings CS)"/>
-      <w:caps/>
-      <w:color w:val="000000" w:themeColor="text1"/>
-      <w:spacing w:val="10"/>
-      <w:szCs w:val="28"/>
-      <w:lang w:eastAsia="ja-JP"/>
-    </w:rPr>
-  </w:style>
-  <w:style w:type="paragraph" w:customStyle="1" w:styleId="A000F6DCE41F47D58E7CE116A6949B204">
-    <w:name w:val="A000F6DCE41F47D58E7CE116A6949B204"/>
-    <w:rsid w:val="00F01FC2"/>
-    <w:pPr>
-      <w:keepNext/>
-      <w:keepLines/>
-      <w:tabs>
-        <w:tab w:val="left" w:pos="2794"/>
-      </w:tabs>
-      <w:spacing w:before="120" w:after="0" w:line="240" w:lineRule="auto"/>
-      <w:outlineLvl w:val="1"/>
-    </w:pPr>
-    <w:rPr>
-      <w:rFonts w:ascii="Calibri" w:eastAsiaTheme="majorEastAsia" w:hAnsi="Calibri" w:cstheme="majorBidi"/>
-      <w:b/>
-      <w:color w:val="000000" w:themeColor="text1"/>
-      <w:szCs w:val="24"/>
-      <w:lang w:eastAsia="ja-JP"/>
-    </w:rPr>
-  </w:style>
-  <w:style w:type="paragraph" w:customStyle="1" w:styleId="B78ADF525D764A02ABD964D5C50568B44">
-    <w:name w:val="B78ADF525D764A02ABD964D5C50568B44"/>
-    <w:rsid w:val="00F01FC2"/>
-    <w:pPr>
-      <w:keepNext/>
-      <w:keepLines/>
-      <w:tabs>
-        <w:tab w:val="left" w:pos="2794"/>
-      </w:tabs>
-      <w:spacing w:before="120" w:after="0" w:line="240" w:lineRule="auto"/>
-      <w:outlineLvl w:val="1"/>
-    </w:pPr>
-    <w:rPr>
-      <w:rFonts w:ascii="Calibri" w:eastAsiaTheme="majorEastAsia" w:hAnsi="Calibri" w:cstheme="majorBidi"/>
-      <w:b/>
-      <w:color w:val="000000" w:themeColor="text1"/>
-      <w:szCs w:val="24"/>
-      <w:lang w:eastAsia="ja-JP"/>
-    </w:rPr>
-  </w:style>
-  <w:style w:type="paragraph" w:customStyle="1" w:styleId="1A09C74938B54B9283D1BF17D2C2B8634">
-    <w:name w:val="1A09C74938B54B9283D1BF17D2C2B8634"/>
-    <w:rsid w:val="00F01FC2"/>
-    <w:pPr>
-      <w:keepNext/>
-      <w:keepLines/>
-      <w:tabs>
-        <w:tab w:val="left" w:pos="2794"/>
-      </w:tabs>
-      <w:spacing w:before="120" w:after="0" w:line="240" w:lineRule="auto"/>
-      <w:outlineLvl w:val="1"/>
-    </w:pPr>
-    <w:rPr>
-      <w:rFonts w:ascii="Calibri" w:eastAsiaTheme="majorEastAsia" w:hAnsi="Calibri" w:cstheme="majorBidi"/>
-      <w:b/>
-      <w:color w:val="000000" w:themeColor="text1"/>
-      <w:szCs w:val="24"/>
-      <w:lang w:eastAsia="ja-JP"/>
-    </w:rPr>
-  </w:style>
-  <w:style w:type="paragraph" w:customStyle="1" w:styleId="35F7ACE96B5F421CA0238219EAD6BC176">
-    <w:name w:val="35F7ACE96B5F421CA0238219EAD6BC176"/>
-    <w:rsid w:val="00F01FC2"/>
-    <w:pPr>
-      <w:keepNext/>
-      <w:keepLines/>
-      <w:spacing w:before="120" w:after="0" w:line="240" w:lineRule="auto"/>
-      <w:outlineLvl w:val="0"/>
-    </w:pPr>
-    <w:rPr>
-      <w:rFonts w:asciiTheme="majorHAnsi" w:eastAsiaTheme="majorEastAsia" w:hAnsiTheme="majorHAnsi" w:cs="Tahoma (Headings CS)"/>
-      <w:caps/>
-      <w:color w:val="000000" w:themeColor="text1"/>
-      <w:spacing w:val="10"/>
-      <w:szCs w:val="28"/>
-      <w:lang w:eastAsia="ja-JP"/>
-    </w:rPr>
-  </w:style>
-  <w:style w:type="paragraph" w:customStyle="1" w:styleId="BC855DF1931D410B94935A4B6F5997D0">
-    <w:name w:val="BC855DF1931D410B94935A4B6F5997D0"/>
-    <w:rsid w:val="00F01FC2"/>
-    <w:pPr>
-      <w:spacing w:line="278" w:lineRule="auto"/>
-    </w:pPr>
-    <w:rPr>
-      <w:kern w:val="2"/>
-      <w:sz w:val="24"/>
-      <w:szCs w:val="24"/>
-      <w:lang w:val="en-IN" w:eastAsia="en-IN" w:bidi="ta-IN"/>
-      <w14:ligatures w14:val="standardContextual"/>
-    </w:rPr>
-  </w:style>
-  <w:style w:type="paragraph" w:customStyle="1" w:styleId="5630BA84F9EA447A83D1B102945887A2">
-    <w:name w:val="5630BA84F9EA447A83D1B102945887A2"/>
-    <w:rsid w:val="00F01FC2"/>
-    <w:pPr>
-      <w:spacing w:line="278" w:lineRule="auto"/>
-    </w:pPr>
-    <w:rPr>
-      <w:kern w:val="2"/>
-      <w:sz w:val="24"/>
-      <w:szCs w:val="24"/>
-      <w:lang w:val="en-IN" w:eastAsia="en-IN" w:bidi="ta-IN"/>
-      <w14:ligatures w14:val="standardContextual"/>
-    </w:rPr>
-  </w:style>
-  <w:style w:type="paragraph" w:customStyle="1" w:styleId="A8ED749845394D3DBA1730EFA7A8AF28">
-    <w:name w:val="A8ED749845394D3DBA1730EFA7A8AF28"/>
-    <w:rsid w:val="00F01FC2"/>
-    <w:pPr>
-      <w:spacing w:line="278" w:lineRule="auto"/>
-    </w:pPr>
-    <w:rPr>
-      <w:kern w:val="2"/>
-      <w:sz w:val="24"/>
-      <w:szCs w:val="24"/>
-      <w:lang w:val="en-IN" w:eastAsia="en-IN" w:bidi="ta-IN"/>
-      <w14:ligatures w14:val="standardContextual"/>
-    </w:rPr>
-  </w:style>
-  <w:style w:type="paragraph" w:customStyle="1" w:styleId="5DAC208637C3465EB705DEF1DCB9CA58">
-    <w:name w:val="5DAC208637C3465EB705DEF1DCB9CA58"/>
-    <w:rsid w:val="00F01FC2"/>
-    <w:pPr>
-      <w:spacing w:line="278" w:lineRule="auto"/>
-    </w:pPr>
-    <w:rPr>
-      <w:kern w:val="2"/>
-      <w:sz w:val="24"/>
-      <w:szCs w:val="24"/>
-      <w:lang w:val="en-IN" w:eastAsia="en-IN" w:bidi="ta-IN"/>
-      <w14:ligatures w14:val="standardContextual"/>
     </w:rPr>
   </w:style>
 </w:styles>
@@ -32666,35 +31952,6 @@
 </file>
 
 <file path=customXml/item1.xml><?xml version="1.0" encoding="utf-8"?>
-<?mso-contentType ?>
-<FormTemplates xmlns="http://schemas.microsoft.com/sharepoint/v3/contenttype/forms">
-  <Display>DocumentLibraryForm</Display>
-  <Edit>DocumentLibraryForm</Edit>
-  <New>DocumentLibraryForm</New>
-</FormTemplates>
-</file>
-
-<file path=customXml/item2.xml><?xml version="1.0" encoding="utf-8"?>
-<p:properties xmlns:p="http://schemas.microsoft.com/office/2006/metadata/properties" xmlns:xsi="http://www.w3.org/2001/XMLSchema-instance" xmlns:pc="http://schemas.microsoft.com/office/infopath/2007/PartnerControls">
-  <documentManagement>
-    <Background xmlns="71af3243-3dd4-4a8d-8c0d-dd76da1f02a5">false</Background>
-    <Status xmlns="71af3243-3dd4-4a8d-8c0d-dd76da1f02a5">Not started</Status>
-    <_ip_UnifiedCompliancePolicyUIAction xmlns="http://schemas.microsoft.com/sharepoint/v3" xsi:nil="true"/>
-    <Image xmlns="71af3243-3dd4-4a8d-8c0d-dd76da1f02a5">
-      <Url xsi:nil="true"/>
-      <Description xsi:nil="true"/>
-    </Image>
-    <_ip_UnifiedCompliancePolicyProperties xmlns="http://schemas.microsoft.com/sharepoint/v3" xsi:nil="true"/>
-    <ImageTagsTaxHTField xmlns="71af3243-3dd4-4a8d-8c0d-dd76da1f02a5">
-      <Terms xmlns="http://schemas.microsoft.com/office/infopath/2007/PartnerControls"/>
-    </ImageTagsTaxHTField>
-    <TaxCatchAll xmlns="230e9df3-be65-4c73-a93b-d1236ebd677e" xsi:nil="true"/>
-    <MediaServiceKeyPoints xmlns="71af3243-3dd4-4a8d-8c0d-dd76da1f02a5" xsi:nil="true"/>
-  </documentManagement>
-</p:properties>
-</file>
-
-<file path=customXml/item3.xml><?xml version="1.0" encoding="utf-8"?>
 <ct:contentTypeSchema xmlns:ct="http://schemas.microsoft.com/office/2006/metadata/contentType" xmlns:ma="http://schemas.microsoft.com/office/2006/metadata/properties/metaAttributes" ct:_="" ma:_="" ma:contentTypeName="Document" ma:contentTypeID="0x01010079F111ED35F8CC479449609E8A0923A6" ma:contentTypeVersion="28" ma:contentTypeDescription="Create a new document." ma:contentTypeScope="" ma:versionID="60f5a4f2d2b0abadcf532d48ebf9cb71">
   <xsd:schema xmlns:xsd="http://www.w3.org/2001/XMLSchema" xmlns:xs="http://www.w3.org/2001/XMLSchema" xmlns:p="http://schemas.microsoft.com/office/2006/metadata/properties" xmlns:ns1="http://schemas.microsoft.com/sharepoint/v3" xmlns:ns2="71af3243-3dd4-4a8d-8c0d-dd76da1f02a5" xmlns:ns3="16c05727-aa75-4e4a-9b5f-8a80a1165891" xmlns:ns4="230e9df3-be65-4c73-a93b-d1236ebd677e" targetNamespace="http://schemas.microsoft.com/office/2006/metadata/properties" ma:root="true" ma:fieldsID="7dd78129e6a1811f84807ad11c651531" ns1:_="" ns2:_="" ns3:_="" ns4:_="">
     <xsd:import namespace="http://schemas.microsoft.com/sharepoint/v3"/>
@@ -33006,27 +32263,36 @@
 </ct:contentTypeSchema>
 </file>
 
-<file path=customXml/itemProps1.xml><?xml version="1.0" encoding="utf-8"?>
-<ds:datastoreItem xmlns:ds="http://schemas.openxmlformats.org/officeDocument/2006/customXml" ds:itemID="{5D9ED3FD-0EE3-43B5-B701-56BB60CEE482}">
-  <ds:schemaRefs>
-    <ds:schemaRef ds:uri="http://schemas.microsoft.com/sharepoint/v3/contenttype/forms"/>
-  </ds:schemaRefs>
-</ds:datastoreItem>
+<file path=customXml/item2.xml><?xml version="1.0" encoding="utf-8"?>
+<p:properties xmlns:p="http://schemas.microsoft.com/office/2006/metadata/properties" xmlns:xsi="http://www.w3.org/2001/XMLSchema-instance" xmlns:pc="http://schemas.microsoft.com/office/infopath/2007/PartnerControls">
+  <documentManagement>
+    <Background xmlns="71af3243-3dd4-4a8d-8c0d-dd76da1f02a5">false</Background>
+    <Status xmlns="71af3243-3dd4-4a8d-8c0d-dd76da1f02a5">Not started</Status>
+    <_ip_UnifiedCompliancePolicyUIAction xmlns="http://schemas.microsoft.com/sharepoint/v3" xsi:nil="true"/>
+    <Image xmlns="71af3243-3dd4-4a8d-8c0d-dd76da1f02a5">
+      <Url xsi:nil="true"/>
+      <Description xsi:nil="true"/>
+    </Image>
+    <_ip_UnifiedCompliancePolicyProperties xmlns="http://schemas.microsoft.com/sharepoint/v3" xsi:nil="true"/>
+    <ImageTagsTaxHTField xmlns="71af3243-3dd4-4a8d-8c0d-dd76da1f02a5">
+      <Terms xmlns="http://schemas.microsoft.com/office/infopath/2007/PartnerControls"/>
+    </ImageTagsTaxHTField>
+    <TaxCatchAll xmlns="230e9df3-be65-4c73-a93b-d1236ebd677e" xsi:nil="true"/>
+    <MediaServiceKeyPoints xmlns="71af3243-3dd4-4a8d-8c0d-dd76da1f02a5" xsi:nil="true"/>
+  </documentManagement>
+</p:properties>
 </file>
 
-<file path=customXml/itemProps2.xml><?xml version="1.0" encoding="utf-8"?>
-<ds:datastoreItem xmlns:ds="http://schemas.openxmlformats.org/officeDocument/2006/customXml" ds:itemID="{2B9F8D08-1D9B-4293-B753-AE33123B7366}">
-  <ds:schemaRefs>
-    <ds:schemaRef ds:uri="http://schemas.microsoft.com/office/2006/metadata/properties"/>
-    <ds:schemaRef ds:uri="http://schemas.microsoft.com/office/infopath/2007/PartnerControls"/>
-    <ds:schemaRef ds:uri="71af3243-3dd4-4a8d-8c0d-dd76da1f02a5"/>
-    <ds:schemaRef ds:uri="http://schemas.microsoft.com/sharepoint/v3"/>
-    <ds:schemaRef ds:uri="230e9df3-be65-4c73-a93b-d1236ebd677e"/>
-  </ds:schemaRefs>
-</ds:datastoreItem>
+<file path=customXml/item3.xml><?xml version="1.0" encoding="utf-8"?>
+<?mso-contentType ?>
+<FormTemplates xmlns="http://schemas.microsoft.com/sharepoint/v3/contenttype/forms">
+  <Display>DocumentLibraryForm</Display>
+  <Edit>DocumentLibraryForm</Edit>
+  <New>DocumentLibraryForm</New>
+</FormTemplates>
 </file>
 
-<file path=customXml/itemProps3.xml><?xml version="1.0" encoding="utf-8"?>
+<file path=customXml/itemProps1.xml><?xml version="1.0" encoding="utf-8"?>
 <ds:datastoreItem xmlns:ds="http://schemas.openxmlformats.org/officeDocument/2006/customXml" ds:itemID="{924B9342-DE5E-463A-B17E-59B0041872FD}">
   <ds:schemaRefs>
     <ds:schemaRef ds:uri="http://schemas.microsoft.com/office/2006/metadata/contentType"/>
@@ -33047,6 +32313,26 @@
 </ds:datastoreItem>
 </file>
 
+<file path=customXml/itemProps2.xml><?xml version="1.0" encoding="utf-8"?>
+<ds:datastoreItem xmlns:ds="http://schemas.openxmlformats.org/officeDocument/2006/customXml" ds:itemID="{2B9F8D08-1D9B-4293-B753-AE33123B7366}">
+  <ds:schemaRefs>
+    <ds:schemaRef ds:uri="http://schemas.microsoft.com/office/2006/metadata/properties"/>
+    <ds:schemaRef ds:uri="http://schemas.microsoft.com/office/infopath/2007/PartnerControls"/>
+    <ds:schemaRef ds:uri="71af3243-3dd4-4a8d-8c0d-dd76da1f02a5"/>
+    <ds:schemaRef ds:uri="http://schemas.microsoft.com/sharepoint/v3"/>
+    <ds:schemaRef ds:uri="230e9df3-be65-4c73-a93b-d1236ebd677e"/>
+  </ds:schemaRefs>
+</ds:datastoreItem>
+</file>
+
+<file path=customXml/itemProps3.xml><?xml version="1.0" encoding="utf-8"?>
+<ds:datastoreItem xmlns:ds="http://schemas.openxmlformats.org/officeDocument/2006/customXml" ds:itemID="{5D9ED3FD-0EE3-43B5-B701-56BB60CEE482}">
+  <ds:schemaRefs>
+    <ds:schemaRef ds:uri="http://schemas.microsoft.com/sharepoint/v3/contenttype/forms"/>
+  </ds:schemaRefs>
+</ds:datastoreItem>
+</file>
+
 <file path=docMetadata/LabelInfo.xml><?xml version="1.0" encoding="utf-8"?>
 <clbl:labelList xmlns:clbl="http://schemas.microsoft.com/office/2020/mipLabelMetadata"/>
 </file>
</xml_diff>

<commit_message>
Modified V15 on my Resume
</commit_message>
<xml_diff>
--- a/Profile Insights/HaryishElangumaranQA-MODEL2.docx
+++ b/Profile Insights/HaryishElangumaranQA-MODEL2.docx
@@ -337,23 +337,13 @@
         </w:rPr>
         <w:t xml:space="preserve">TestNG, </w:t>
       </w:r>
-      <w:proofErr w:type="spellStart"/>
       <w:r>
         <w:rPr>
           <w:b/>
           <w:bCs/>
           <w:lang w:val="en-IN"/>
         </w:rPr>
-        <w:t>PyTest</w:t>
-      </w:r>
-      <w:proofErr w:type="spellEnd"/>
-      <w:r>
-        <w:rPr>
-          <w:b/>
-          <w:bCs/>
-          <w:lang w:val="en-IN"/>
-        </w:rPr>
-        <w:t>, and Robot Framework</w:t>
+        <w:t>PyTest, and Robot Framework</w:t>
       </w:r>
       <w:r>
         <w:rPr>
@@ -426,25 +416,7 @@
           <w:bCs/>
           <w:lang w:val="en-IN"/>
         </w:rPr>
-        <w:t xml:space="preserve">Postman, Jira, </w:t>
-      </w:r>
-      <w:proofErr w:type="spellStart"/>
-      <w:r>
-        <w:rPr>
-          <w:b/>
-          <w:bCs/>
-          <w:lang w:val="en-IN"/>
-        </w:rPr>
-        <w:t>BrowserStack</w:t>
-      </w:r>
-      <w:proofErr w:type="spellEnd"/>
-      <w:r>
-        <w:rPr>
-          <w:b/>
-          <w:bCs/>
-          <w:lang w:val="en-IN"/>
-        </w:rPr>
-        <w:t>, Perfecto, Snowflake, and Azure CLI</w:t>
+        <w:t>Postman, Jira, BrowserStack, Perfecto, Snowflake, and Azure CLI</w:t>
       </w:r>
       <w:r>
         <w:rPr>
@@ -805,6 +777,60 @@
           <w:lang w:val="en-IN"/>
         </w:rPr>
         <w:t>.</w:t>
+      </w:r>
+    </w:p>
+    <w:p>
+      <w:pPr>
+        <w:pStyle w:val="NormalIndent"/>
+        <w:numPr>
+          <w:ilvl w:val="0"/>
+          <w:numId w:val="16"/>
+        </w:numPr>
+        <w:rPr>
+          <w:lang w:val="en-IN"/>
+        </w:rPr>
+      </w:pPr>
+      <w:r>
+        <w:rPr>
+          <w:lang w:val="en-IN"/>
+        </w:rPr>
+        <w:t>Employed UI Testing using</w:t>
+      </w:r>
+      <w:r>
+        <w:rPr>
+          <w:b/>
+          <w:bCs/>
+          <w:lang w:val="en-IN"/>
+        </w:rPr>
+        <w:t xml:space="preserve"> Java Selenium + TestNG, </w:t>
+      </w:r>
+      <w:r>
+        <w:rPr>
+          <w:lang w:val="en-IN"/>
+        </w:rPr>
+        <w:t xml:space="preserve">API Testing via </w:t>
+      </w:r>
+      <w:r>
+        <w:rPr>
+          <w:b/>
+          <w:bCs/>
+          <w:lang w:val="en-IN"/>
+        </w:rPr>
+        <w:t xml:space="preserve">Postman, </w:t>
+      </w:r>
+      <w:r>
+        <w:rPr>
+          <w:lang w:val="en-IN"/>
+        </w:rPr>
+        <w:t xml:space="preserve">and Mobile Testing using </w:t>
+      </w:r>
+      <w:r>
+        <w:rPr>
+          <w:b/>
+          <w:bCs/>
+          <w:lang w:val="en-IN"/>
+        </w:rPr>
+        <w:t>Browserstack.</w:t>
       </w:r>
     </w:p>
     <w:p>
@@ -1199,6 +1225,7 @@
         <w:pStyle w:val="Heading1"/>
       </w:pPr>
       <w:r>
+        <w:lastRenderedPageBreak/>
         <w:t>Skills &amp; Abilities</w:t>
       </w:r>
     </w:p>
@@ -1309,7 +1336,6 @@
                 <w:color w:val="262626"/>
                 <w:lang w:eastAsia="en-IN" w:bidi="ta-IN"/>
               </w:rPr>
-              <w:lastRenderedPageBreak/>
               <w:t>Testing Execution Types</w:t>
             </w:r>
           </w:p>
@@ -1844,18 +1870,8 @@
                 <w:color w:val="000000"/>
                 <w:lang w:val="en-IN" w:eastAsia="en-IN" w:bidi="ta-IN"/>
               </w:rPr>
-              <w:t xml:space="preserve">| </w:t>
+              <w:t>| PyTest</w:t>
             </w:r>
-            <w:proofErr w:type="spellStart"/>
-            <w:r>
-              <w:rPr>
-                <w:rFonts w:eastAsia="Times New Roman" w:cs="Calibri"/>
-                <w:color w:val="000000"/>
-                <w:lang w:val="en-IN" w:eastAsia="en-IN" w:bidi="ta-IN"/>
-              </w:rPr>
-              <w:t>PyTest</w:t>
-            </w:r>
-            <w:proofErr w:type="spellEnd"/>
             <w:r>
               <w:rPr>
                 <w:rFonts w:eastAsia="Times New Roman" w:cs="Calibri"/>
@@ -1988,25 +2004,7 @@
                 <w:color w:val="000000"/>
                 <w:lang w:val="en-IN" w:eastAsia="en-IN" w:bidi="ta-IN"/>
               </w:rPr>
-              <w:t xml:space="preserve">Jenkins| </w:t>
-            </w:r>
-            <w:proofErr w:type="spellStart"/>
-            <w:r>
-              <w:rPr>
-                <w:rFonts w:eastAsia="Times New Roman" w:cs="Calibri"/>
-                <w:color w:val="000000"/>
-                <w:lang w:val="en-IN" w:eastAsia="en-IN" w:bidi="ta-IN"/>
-              </w:rPr>
-              <w:t>Github</w:t>
-            </w:r>
-            <w:proofErr w:type="spellEnd"/>
-            <w:r>
-              <w:rPr>
-                <w:rFonts w:eastAsia="Times New Roman" w:cs="Calibri"/>
-                <w:color w:val="000000"/>
-                <w:lang w:val="en-IN" w:eastAsia="en-IN" w:bidi="ta-IN"/>
-              </w:rPr>
-              <w:t xml:space="preserve"> Actions</w:t>
+              <w:t>Jenkins| Github Actions</w:t>
             </w:r>
           </w:p>
         </w:tc>
@@ -2231,25 +2229,7 @@
                 <w:color w:val="000000"/>
                 <w:lang w:val="en-IN" w:eastAsia="en-IN" w:bidi="ta-IN"/>
               </w:rPr>
-              <w:t xml:space="preserve">Vision Plus Testing (via </w:t>
-            </w:r>
-            <w:proofErr w:type="spellStart"/>
-            <w:r>
-              <w:rPr>
-                <w:rFonts w:eastAsia="Times New Roman" w:cs="Calibri"/>
-                <w:color w:val="000000"/>
-                <w:lang w:val="en-IN" w:eastAsia="en-IN" w:bidi="ta-IN"/>
-              </w:rPr>
-              <w:t>Bluezone</w:t>
-            </w:r>
-            <w:proofErr w:type="spellEnd"/>
-            <w:r>
-              <w:rPr>
-                <w:rFonts w:eastAsia="Times New Roman" w:cs="Calibri"/>
-                <w:color w:val="000000"/>
-                <w:lang w:val="en-IN" w:eastAsia="en-IN" w:bidi="ta-IN"/>
-              </w:rPr>
-              <w:t xml:space="preserve"> Mainframe)</w:t>
+              <w:t>Vision Plus Testing (via Bluezone Mainframe)</w:t>
             </w:r>
           </w:p>
         </w:tc>
@@ -2673,18 +2653,8 @@
           <w:bCs/>
           <w:lang w:val="en-IN"/>
         </w:rPr>
-        <w:t xml:space="preserve"> </w:t>
+        <w:t xml:space="preserve"> Browerstack</w:t>
       </w:r>
-      <w:proofErr w:type="spellStart"/>
-      <w:r>
-        <w:rPr>
-          <w:b/>
-          <w:bCs/>
-          <w:lang w:val="en-IN"/>
-        </w:rPr>
-        <w:t>Browerstack</w:t>
-      </w:r>
-      <w:proofErr w:type="spellEnd"/>
       <w:r>
         <w:rPr>
           <w:lang w:val="en-IN"/>
@@ -2712,43 +2682,19 @@
         </w:rPr>
         <w:t xml:space="preserve">Have involved in </w:t>
       </w:r>
-      <w:proofErr w:type="spellStart"/>
       <w:r>
         <w:rPr>
           <w:b/>
           <w:bCs/>
           <w:lang w:val="en-IN"/>
         </w:rPr>
-        <w:t>VisionPlus</w:t>
-      </w:r>
-      <w:proofErr w:type="spellEnd"/>
-      <w:r>
-        <w:rPr>
-          <w:b/>
-          <w:bCs/>
-          <w:lang w:val="en-IN"/>
-        </w:rPr>
-        <w:t xml:space="preserve"> testing</w:t>
+        <w:t>VisionPlus testing</w:t>
       </w:r>
       <w:r>
         <w:rPr>
           <w:lang w:val="en-IN"/>
         </w:rPr>
-        <w:t xml:space="preserve"> (under modules FAS, CMS, TRAMS, LMS) on </w:t>
-      </w:r>
-      <w:proofErr w:type="spellStart"/>
-      <w:r>
-        <w:rPr>
-          <w:lang w:val="en-IN"/>
-        </w:rPr>
-        <w:t>BlueZone</w:t>
-      </w:r>
-      <w:proofErr w:type="spellEnd"/>
-      <w:r>
-        <w:rPr>
-          <w:lang w:val="en-IN"/>
-        </w:rPr>
-        <w:t xml:space="preserve"> Mainframe for testing various credit card functionalities.</w:t>
+        <w:t xml:space="preserve"> (under modules FAS, CMS, TRAMS, LMS) on BlueZone Mainframe for testing various credit card functionalities.</w:t>
       </w:r>
     </w:p>
     <w:p>
@@ -2875,6 +2821,7 @@
         <w:pStyle w:val="Heading1"/>
       </w:pPr>
       <w:r>
+        <w:lastRenderedPageBreak/>
         <w:t>COURSE AND CERTIFICATION</w:t>
       </w:r>
     </w:p>
@@ -2955,7 +2902,6 @@
           <w:bCs/>
           <w:lang w:val="en-IN"/>
         </w:rPr>
-        <w:lastRenderedPageBreak/>
         <w:t>Diploma in Web Designing</w:t>
       </w:r>
       <w:r>
@@ -3131,16 +3077,8 @@
         <w:rPr>
           <w:bCs/>
         </w:rPr>
-        <w:t xml:space="preserve">Cognizant's </w:t>
+        <w:t>Cognizant's Bluebolt</w:t>
       </w:r>
-      <w:proofErr w:type="spellStart"/>
-      <w:r>
-        <w:rPr>
-          <w:bCs/>
-        </w:rPr>
-        <w:t>Bluebolt</w:t>
-      </w:r>
-      <w:proofErr w:type="spellEnd"/>
       <w:r>
         <w:t> Innovatio</w:t>
       </w:r>
@@ -3169,15 +3107,7 @@
     </w:p>
     <w:p>
       <w:r>
-        <w:t xml:space="preserve">With the opportunity to Cognizant’s </w:t>
-      </w:r>
-      <w:proofErr w:type="spellStart"/>
-      <w:r>
-        <w:t>BlueBolt</w:t>
-      </w:r>
-      <w:proofErr w:type="spellEnd"/>
-      <w:r>
-        <w:t xml:space="preserve"> Innovation, that creates opportunities for </w:t>
+        <w:t xml:space="preserve">With the opportunity to Cognizant’s BlueBolt Innovation, that creates opportunities for </w:t>
       </w:r>
       <w:r>
         <w:t>developers to record their innovations that brings efficiency to the system development,</w:t>
@@ -3519,13 +3449,8 @@
         <w:spacing w:before="0"/>
         <w:jc w:val="both"/>
       </w:pPr>
-      <w:proofErr w:type="spellStart"/>
       <w:r>
-        <w:t>Github</w:t>
-      </w:r>
-      <w:proofErr w:type="spellEnd"/>
-      <w:r>
-        <w:t>:</w:t>
+        <w:t>Github:</w:t>
       </w:r>
       <w:r>
         <w:t xml:space="preserve"> </w:t>
@@ -31217,12 +31142,14 @@
     <w:rsid w:val="004C04F3"/>
     <w:rsid w:val="00592E7B"/>
     <w:rsid w:val="00647800"/>
+    <w:rsid w:val="007F3C9B"/>
     <w:rsid w:val="00924A96"/>
     <w:rsid w:val="0097644A"/>
     <w:rsid w:val="00BB7F9F"/>
     <w:rsid w:val="00BC22DC"/>
     <w:rsid w:val="00BE541F"/>
     <w:rsid w:val="00C9000E"/>
+    <w:rsid w:val="00CC6FBF"/>
     <w:rsid w:val="00D31FBD"/>
     <w:rsid w:val="00DF4FB3"/>
     <w:rsid w:val="00F01FC2"/>
@@ -31952,6 +31879,35 @@
 </file>
 
 <file path=customXml/item1.xml><?xml version="1.0" encoding="utf-8"?>
+<?mso-contentType ?>
+<FormTemplates xmlns="http://schemas.microsoft.com/sharepoint/v3/contenttype/forms">
+  <Display>DocumentLibraryForm</Display>
+  <Edit>DocumentLibraryForm</Edit>
+  <New>DocumentLibraryForm</New>
+</FormTemplates>
+</file>
+
+<file path=customXml/item2.xml><?xml version="1.0" encoding="utf-8"?>
+<p:properties xmlns:p="http://schemas.microsoft.com/office/2006/metadata/properties" xmlns:xsi="http://www.w3.org/2001/XMLSchema-instance" xmlns:pc="http://schemas.microsoft.com/office/infopath/2007/PartnerControls">
+  <documentManagement>
+    <Background xmlns="71af3243-3dd4-4a8d-8c0d-dd76da1f02a5">false</Background>
+    <Status xmlns="71af3243-3dd4-4a8d-8c0d-dd76da1f02a5">Not started</Status>
+    <_ip_UnifiedCompliancePolicyUIAction xmlns="http://schemas.microsoft.com/sharepoint/v3" xsi:nil="true"/>
+    <Image xmlns="71af3243-3dd4-4a8d-8c0d-dd76da1f02a5">
+      <Url xsi:nil="true"/>
+      <Description xsi:nil="true"/>
+    </Image>
+    <_ip_UnifiedCompliancePolicyProperties xmlns="http://schemas.microsoft.com/sharepoint/v3" xsi:nil="true"/>
+    <ImageTagsTaxHTField xmlns="71af3243-3dd4-4a8d-8c0d-dd76da1f02a5">
+      <Terms xmlns="http://schemas.microsoft.com/office/infopath/2007/PartnerControls"/>
+    </ImageTagsTaxHTField>
+    <TaxCatchAll xmlns="230e9df3-be65-4c73-a93b-d1236ebd677e" xsi:nil="true"/>
+    <MediaServiceKeyPoints xmlns="71af3243-3dd4-4a8d-8c0d-dd76da1f02a5" xsi:nil="true"/>
+  </documentManagement>
+</p:properties>
+</file>
+
+<file path=customXml/item3.xml><?xml version="1.0" encoding="utf-8"?>
 <ct:contentTypeSchema xmlns:ct="http://schemas.microsoft.com/office/2006/metadata/contentType" xmlns:ma="http://schemas.microsoft.com/office/2006/metadata/properties/metaAttributes" ct:_="" ma:_="" ma:contentTypeName="Document" ma:contentTypeID="0x01010079F111ED35F8CC479449609E8A0923A6" ma:contentTypeVersion="28" ma:contentTypeDescription="Create a new document." ma:contentTypeScope="" ma:versionID="60f5a4f2d2b0abadcf532d48ebf9cb71">
   <xsd:schema xmlns:xsd="http://www.w3.org/2001/XMLSchema" xmlns:xs="http://www.w3.org/2001/XMLSchema" xmlns:p="http://schemas.microsoft.com/office/2006/metadata/properties" xmlns:ns1="http://schemas.microsoft.com/sharepoint/v3" xmlns:ns2="71af3243-3dd4-4a8d-8c0d-dd76da1f02a5" xmlns:ns3="16c05727-aa75-4e4a-9b5f-8a80a1165891" xmlns:ns4="230e9df3-be65-4c73-a93b-d1236ebd677e" targetNamespace="http://schemas.microsoft.com/office/2006/metadata/properties" ma:root="true" ma:fieldsID="7dd78129e6a1811f84807ad11c651531" ns1:_="" ns2:_="" ns3:_="" ns4:_="">
     <xsd:import namespace="http://schemas.microsoft.com/sharepoint/v3"/>
@@ -32263,36 +32219,27 @@
 </ct:contentTypeSchema>
 </file>
 
-<file path=customXml/item2.xml><?xml version="1.0" encoding="utf-8"?>
-<p:properties xmlns:p="http://schemas.microsoft.com/office/2006/metadata/properties" xmlns:xsi="http://www.w3.org/2001/XMLSchema-instance" xmlns:pc="http://schemas.microsoft.com/office/infopath/2007/PartnerControls">
-  <documentManagement>
-    <Background xmlns="71af3243-3dd4-4a8d-8c0d-dd76da1f02a5">false</Background>
-    <Status xmlns="71af3243-3dd4-4a8d-8c0d-dd76da1f02a5">Not started</Status>
-    <_ip_UnifiedCompliancePolicyUIAction xmlns="http://schemas.microsoft.com/sharepoint/v3" xsi:nil="true"/>
-    <Image xmlns="71af3243-3dd4-4a8d-8c0d-dd76da1f02a5">
-      <Url xsi:nil="true"/>
-      <Description xsi:nil="true"/>
-    </Image>
-    <_ip_UnifiedCompliancePolicyProperties xmlns="http://schemas.microsoft.com/sharepoint/v3" xsi:nil="true"/>
-    <ImageTagsTaxHTField xmlns="71af3243-3dd4-4a8d-8c0d-dd76da1f02a5">
-      <Terms xmlns="http://schemas.microsoft.com/office/infopath/2007/PartnerControls"/>
-    </ImageTagsTaxHTField>
-    <TaxCatchAll xmlns="230e9df3-be65-4c73-a93b-d1236ebd677e" xsi:nil="true"/>
-    <MediaServiceKeyPoints xmlns="71af3243-3dd4-4a8d-8c0d-dd76da1f02a5" xsi:nil="true"/>
-  </documentManagement>
-</p:properties>
+<file path=customXml/itemProps1.xml><?xml version="1.0" encoding="utf-8"?>
+<ds:datastoreItem xmlns:ds="http://schemas.openxmlformats.org/officeDocument/2006/customXml" ds:itemID="{5D9ED3FD-0EE3-43B5-B701-56BB60CEE482}">
+  <ds:schemaRefs>
+    <ds:schemaRef ds:uri="http://schemas.microsoft.com/sharepoint/v3/contenttype/forms"/>
+  </ds:schemaRefs>
+</ds:datastoreItem>
 </file>
 
-<file path=customXml/item3.xml><?xml version="1.0" encoding="utf-8"?>
-<?mso-contentType ?>
-<FormTemplates xmlns="http://schemas.microsoft.com/sharepoint/v3/contenttype/forms">
-  <Display>DocumentLibraryForm</Display>
-  <Edit>DocumentLibraryForm</Edit>
-  <New>DocumentLibraryForm</New>
-</FormTemplates>
+<file path=customXml/itemProps2.xml><?xml version="1.0" encoding="utf-8"?>
+<ds:datastoreItem xmlns:ds="http://schemas.openxmlformats.org/officeDocument/2006/customXml" ds:itemID="{2B9F8D08-1D9B-4293-B753-AE33123B7366}">
+  <ds:schemaRefs>
+    <ds:schemaRef ds:uri="http://schemas.microsoft.com/office/2006/metadata/properties"/>
+    <ds:schemaRef ds:uri="http://schemas.microsoft.com/office/infopath/2007/PartnerControls"/>
+    <ds:schemaRef ds:uri="71af3243-3dd4-4a8d-8c0d-dd76da1f02a5"/>
+    <ds:schemaRef ds:uri="http://schemas.microsoft.com/sharepoint/v3"/>
+    <ds:schemaRef ds:uri="230e9df3-be65-4c73-a93b-d1236ebd677e"/>
+  </ds:schemaRefs>
+</ds:datastoreItem>
 </file>
 
-<file path=customXml/itemProps1.xml><?xml version="1.0" encoding="utf-8"?>
+<file path=customXml/itemProps3.xml><?xml version="1.0" encoding="utf-8"?>
 <ds:datastoreItem xmlns:ds="http://schemas.openxmlformats.org/officeDocument/2006/customXml" ds:itemID="{924B9342-DE5E-463A-B17E-59B0041872FD}">
   <ds:schemaRefs>
     <ds:schemaRef ds:uri="http://schemas.microsoft.com/office/2006/metadata/contentType"/>
@@ -32313,26 +32260,6 @@
 </ds:datastoreItem>
 </file>
 
-<file path=customXml/itemProps2.xml><?xml version="1.0" encoding="utf-8"?>
-<ds:datastoreItem xmlns:ds="http://schemas.openxmlformats.org/officeDocument/2006/customXml" ds:itemID="{2B9F8D08-1D9B-4293-B753-AE33123B7366}">
-  <ds:schemaRefs>
-    <ds:schemaRef ds:uri="http://schemas.microsoft.com/office/2006/metadata/properties"/>
-    <ds:schemaRef ds:uri="http://schemas.microsoft.com/office/infopath/2007/PartnerControls"/>
-    <ds:schemaRef ds:uri="71af3243-3dd4-4a8d-8c0d-dd76da1f02a5"/>
-    <ds:schemaRef ds:uri="http://schemas.microsoft.com/sharepoint/v3"/>
-    <ds:schemaRef ds:uri="230e9df3-be65-4c73-a93b-d1236ebd677e"/>
-  </ds:schemaRefs>
-</ds:datastoreItem>
-</file>
-
-<file path=customXml/itemProps3.xml><?xml version="1.0" encoding="utf-8"?>
-<ds:datastoreItem xmlns:ds="http://schemas.openxmlformats.org/officeDocument/2006/customXml" ds:itemID="{5D9ED3FD-0EE3-43B5-B701-56BB60CEE482}">
-  <ds:schemaRefs>
-    <ds:schemaRef ds:uri="http://schemas.microsoft.com/sharepoint/v3/contenttype/forms"/>
-  </ds:schemaRefs>
-</ds:datastoreItem>
-</file>
-
 <file path=docMetadata/LabelInfo.xml><?xml version="1.0" encoding="utf-8"?>
 <clbl:labelList xmlns:clbl="http://schemas.microsoft.com/office/2020/mipLabelMetadata"/>
 </file>
</xml_diff>

<commit_message>
Added New Updated resume
</commit_message>
<xml_diff>
--- a/Profile Insights/HaryishElangumaranQA-MODEL2.docx
+++ b/Profile Insights/HaryishElangumaranQA-MODEL2.docx
@@ -337,13 +337,23 @@
         </w:rPr>
         <w:t xml:space="preserve">TestNG, </w:t>
       </w:r>
+      <w:proofErr w:type="spellStart"/>
       <w:r>
         <w:rPr>
           <w:b/>
           <w:bCs/>
           <w:lang w:val="en-IN"/>
         </w:rPr>
-        <w:t>PyTest, and Robot Framework</w:t>
+        <w:t>PyTest</w:t>
+      </w:r>
+      <w:proofErr w:type="spellEnd"/>
+      <w:r>
+        <w:rPr>
+          <w:b/>
+          <w:bCs/>
+          <w:lang w:val="en-IN"/>
+        </w:rPr>
+        <w:t>, and Robot Framework</w:t>
       </w:r>
       <w:r>
         <w:rPr>
@@ -416,7 +426,25 @@
           <w:bCs/>
           <w:lang w:val="en-IN"/>
         </w:rPr>
-        <w:t>Postman, Jira, BrowserStack, Perfecto, Snowflake, and Azure CLI</w:t>
+        <w:t xml:space="preserve">Postman, Jira, </w:t>
+      </w:r>
+      <w:proofErr w:type="spellStart"/>
+      <w:r>
+        <w:rPr>
+          <w:b/>
+          <w:bCs/>
+          <w:lang w:val="en-IN"/>
+        </w:rPr>
+        <w:t>BrowserStack</w:t>
+      </w:r>
+      <w:proofErr w:type="spellEnd"/>
+      <w:r>
+        <w:rPr>
+          <w:b/>
+          <w:bCs/>
+          <w:lang w:val="en-IN"/>
+        </w:rPr>
+        <w:t>, Perfecto, Snowflake, and Azure CLI</w:t>
       </w:r>
       <w:r>
         <w:rPr>
@@ -549,7 +577,7 @@
         <w:rPr>
           <w:rStyle w:val="NotBold"/>
         </w:rPr>
-        <w:t>Present</w:t>
+        <w:t>Jan 2026</w:t>
       </w:r>
       <w:r>
         <w:tab/>
@@ -798,6 +826,20 @@
       </w:r>
       <w:r>
         <w:rPr>
+          <w:lang w:val="en-IN"/>
+        </w:rPr>
+        <w:t xml:space="preserve"> </w:t>
+      </w:r>
+      <w:r>
+        <w:rPr>
+          <w:b/>
+          <w:bCs/>
+          <w:lang w:val="en-IN"/>
+        </w:rPr>
+        <w:t>Cypress,</w:t>
+      </w:r>
+      <w:r>
+        <w:rPr>
           <w:b/>
           <w:bCs/>
           <w:lang w:val="en-IN"/>
@@ -806,9 +848,17 @@
       </w:r>
       <w:r>
         <w:rPr>
+          <w:b/>
+          <w:bCs/>
           <w:lang w:val="en-IN"/>
         </w:rPr>
-        <w:t xml:space="preserve">API Testing via </w:t>
+        <w:t>API Testing</w:t>
+      </w:r>
+      <w:r>
+        <w:rPr>
+          <w:lang w:val="en-IN"/>
+        </w:rPr>
+        <w:t xml:space="preserve"> via </w:t>
       </w:r>
       <w:r>
         <w:rPr>
@@ -824,13 +874,23 @@
         </w:rPr>
         <w:t xml:space="preserve">and Mobile Testing using </w:t>
       </w:r>
+      <w:proofErr w:type="spellStart"/>
       <w:r>
         <w:rPr>
           <w:b/>
           <w:bCs/>
           <w:lang w:val="en-IN"/>
         </w:rPr>
-        <w:t>Browserstack.</w:t>
+        <w:t>Browserstack</w:t>
+      </w:r>
+      <w:proofErr w:type="spellEnd"/>
+      <w:r>
+        <w:rPr>
+          <w:b/>
+          <w:bCs/>
+          <w:lang w:val="en-IN"/>
+        </w:rPr>
+        <w:t>.</w:t>
       </w:r>
     </w:p>
     <w:p>
@@ -1137,6 +1197,9 @@
       <w:r>
         <w:t>Master of Computer Applications</w:t>
       </w:r>
+      <w:r>
+        <w:t xml:space="preserve"> (MCA)</w:t>
+      </w:r>
     </w:p>
     <w:p>
       <w:pPr>
@@ -1188,6 +1251,9 @@
       <w:r>
         <w:t>Bachelor of Computer Applications</w:t>
       </w:r>
+      <w:r>
+        <w:t xml:space="preserve"> (BCA)</w:t>
+      </w:r>
     </w:p>
     <w:p>
       <w:pPr>
@@ -1217,7 +1283,25 @@
           <w:color w:val="000000" w:themeColor="text1"/>
           <w:szCs w:val="24"/>
         </w:rPr>
-        <w:t>Completed with 80% in Regular education (full time).</w:t>
+        <w:t xml:space="preserve">Completed with 80% </w:t>
+      </w:r>
+      <w:r>
+        <w:rPr>
+          <w:rFonts w:eastAsiaTheme="majorEastAsia" w:cstheme="majorBidi"/>
+          <w:bCs/>
+          <w:color w:val="000000" w:themeColor="text1"/>
+          <w:szCs w:val="24"/>
+        </w:rPr>
+        <w:t>through</w:t>
+      </w:r>
+      <w:r>
+        <w:rPr>
+          <w:rFonts w:eastAsiaTheme="majorEastAsia" w:cstheme="majorBidi"/>
+          <w:bCs/>
+          <w:color w:val="000000" w:themeColor="text1"/>
+          <w:szCs w:val="24"/>
+        </w:rPr>
+        <w:t xml:space="preserve"> Regular education (full time).</w:t>
       </w:r>
     </w:p>
     <w:p>
@@ -1287,6 +1371,9 @@
     <w:p>
       <w:pPr>
         <w:pStyle w:val="Line"/>
+        <w:rPr>
+          <w:sz w:val="20"/>
+        </w:rPr>
       </w:pPr>
     </w:p>
     <w:p>
@@ -1420,7 +1507,23 @@
                 <w:color w:val="000000"/>
                 <w:lang w:val="en-IN" w:eastAsia="en-IN" w:bidi="ta-IN"/>
               </w:rPr>
-              <w:t>STLC (Software Testing Life Cycle)| Waterfall</w:t>
+              <w:t>STLC</w:t>
+            </w:r>
+            <w:r>
+              <w:rPr>
+                <w:rFonts w:eastAsia="Times New Roman" w:cs="Calibri"/>
+                <w:color w:val="000000"/>
+                <w:lang w:val="en-IN" w:eastAsia="en-IN" w:bidi="ta-IN"/>
+              </w:rPr>
+              <w:t xml:space="preserve"> </w:t>
+            </w:r>
+            <w:r>
+              <w:rPr>
+                <w:rFonts w:eastAsia="Times New Roman" w:cs="Calibri"/>
+                <w:color w:val="000000"/>
+                <w:lang w:val="en-IN" w:eastAsia="en-IN" w:bidi="ta-IN"/>
+              </w:rPr>
+              <w:t>| Waterfall</w:t>
             </w:r>
             <w:r>
               <w:rPr>
@@ -1681,6 +1784,16 @@
               </w:rPr>
               <w:t>SQL and platform</w:t>
             </w:r>
+            <w:r>
+              <w:rPr>
+                <w:rFonts w:eastAsia="Times New Roman" w:cs="Calibri"/>
+                <w:b/>
+                <w:bCs/>
+                <w:color w:val="262626"/>
+                <w:lang w:eastAsia="en-IN" w:bidi="ta-IN"/>
+              </w:rPr>
+              <w:t>s</w:t>
+            </w:r>
           </w:p>
         </w:tc>
         <w:tc>
@@ -1854,7 +1967,41 @@
                 <w:color w:val="000000"/>
                 <w:lang w:val="en-IN" w:eastAsia="en-IN" w:bidi="ta-IN"/>
               </w:rPr>
-              <w:t>Cypress| TestNG</w:t>
+              <w:t>Cypress</w:t>
+            </w:r>
+            <w:r>
+              <w:rPr>
+                <w:rFonts w:eastAsia="Times New Roman" w:cs="Calibri"/>
+                <w:color w:val="000000"/>
+                <w:lang w:val="en-IN" w:eastAsia="en-IN" w:bidi="ta-IN"/>
+              </w:rPr>
+              <w:t xml:space="preserve">| </w:t>
+            </w:r>
+            <w:proofErr w:type="spellStart"/>
+            <w:r>
+              <w:rPr>
+                <w:rFonts w:eastAsia="Times New Roman" w:cs="Calibri"/>
+                <w:color w:val="000000"/>
+                <w:lang w:val="en-IN" w:eastAsia="en-IN" w:bidi="ta-IN"/>
+              </w:rPr>
+              <w:t>Node.Js</w:t>
+            </w:r>
+            <w:proofErr w:type="spellEnd"/>
+            <w:r>
+              <w:rPr>
+                <w:rFonts w:eastAsia="Times New Roman" w:cs="Calibri"/>
+                <w:color w:val="000000"/>
+                <w:lang w:val="en-IN" w:eastAsia="en-IN" w:bidi="ta-IN"/>
+              </w:rPr>
+              <w:t xml:space="preserve"> </w:t>
+            </w:r>
+            <w:r>
+              <w:rPr>
+                <w:rFonts w:eastAsia="Times New Roman" w:cs="Calibri"/>
+                <w:color w:val="000000"/>
+                <w:lang w:val="en-IN" w:eastAsia="en-IN" w:bidi="ta-IN"/>
+              </w:rPr>
+              <w:t>| TestNG</w:t>
             </w:r>
             <w:r>
               <w:rPr>
@@ -1870,8 +2017,18 @@
                 <w:color w:val="000000"/>
                 <w:lang w:val="en-IN" w:eastAsia="en-IN" w:bidi="ta-IN"/>
               </w:rPr>
-              <w:t>| PyTest</w:t>
+              <w:t xml:space="preserve">| </w:t>
             </w:r>
+            <w:proofErr w:type="spellStart"/>
+            <w:r>
+              <w:rPr>
+                <w:rFonts w:eastAsia="Times New Roman" w:cs="Calibri"/>
+                <w:color w:val="000000"/>
+                <w:lang w:val="en-IN" w:eastAsia="en-IN" w:bidi="ta-IN"/>
+              </w:rPr>
+              <w:t>PyTest</w:t>
+            </w:r>
+            <w:proofErr w:type="spellEnd"/>
             <w:r>
               <w:rPr>
                 <w:rFonts w:eastAsia="Times New Roman" w:cs="Calibri"/>
@@ -2004,7 +2161,25 @@
                 <w:color w:val="000000"/>
                 <w:lang w:val="en-IN" w:eastAsia="en-IN" w:bidi="ta-IN"/>
               </w:rPr>
-              <w:t>Jenkins| Github Actions</w:t>
+              <w:t xml:space="preserve">Jenkins| </w:t>
+            </w:r>
+            <w:proofErr w:type="spellStart"/>
+            <w:r>
+              <w:rPr>
+                <w:rFonts w:eastAsia="Times New Roman" w:cs="Calibri"/>
+                <w:color w:val="000000"/>
+                <w:lang w:val="en-IN" w:eastAsia="en-IN" w:bidi="ta-IN"/>
+              </w:rPr>
+              <w:t>Github</w:t>
+            </w:r>
+            <w:proofErr w:type="spellEnd"/>
+            <w:r>
+              <w:rPr>
+                <w:rFonts w:eastAsia="Times New Roman" w:cs="Calibri"/>
+                <w:color w:val="000000"/>
+                <w:lang w:val="en-IN" w:eastAsia="en-IN" w:bidi="ta-IN"/>
+              </w:rPr>
+              <w:t xml:space="preserve"> Actions</w:t>
             </w:r>
           </w:p>
         </w:tc>
@@ -2138,23 +2313,7 @@
                 <w:color w:val="000000"/>
                 <w:lang w:val="en-IN" w:eastAsia="en-IN" w:bidi="ta-IN"/>
               </w:rPr>
-              <w:t>Exploratory (APIs)|Smoke| Sanity|</w:t>
-            </w:r>
-            <w:r>
-              <w:rPr>
-                <w:rFonts w:eastAsia="Times New Roman" w:cs="Calibri"/>
-                <w:color w:val="000000"/>
-                <w:lang w:val="en-IN" w:eastAsia="en-IN" w:bidi="ta-IN"/>
-              </w:rPr>
-              <w:t>UAT</w:t>
-            </w:r>
-            <w:r>
-              <w:rPr>
-                <w:rFonts w:eastAsia="Times New Roman" w:cs="Calibri"/>
-                <w:color w:val="000000"/>
-                <w:lang w:val="en-IN" w:eastAsia="en-IN" w:bidi="ta-IN"/>
-              </w:rPr>
-              <w:t>|</w:t>
+              <w:t>Exploratory |Smoke| Sanity|</w:t>
             </w:r>
             <w:r>
               <w:rPr>
@@ -2229,7 +2388,25 @@
                 <w:color w:val="000000"/>
                 <w:lang w:val="en-IN" w:eastAsia="en-IN" w:bidi="ta-IN"/>
               </w:rPr>
-              <w:t>Vision Plus Testing (via Bluezone Mainframe)</w:t>
+              <w:t xml:space="preserve">Vision Plus Testing (via </w:t>
+            </w:r>
+            <w:proofErr w:type="spellStart"/>
+            <w:r>
+              <w:rPr>
+                <w:rFonts w:eastAsia="Times New Roman" w:cs="Calibri"/>
+                <w:color w:val="000000"/>
+                <w:lang w:val="en-IN" w:eastAsia="en-IN" w:bidi="ta-IN"/>
+              </w:rPr>
+              <w:t>Bluezone</w:t>
+            </w:r>
+            <w:proofErr w:type="spellEnd"/>
+            <w:r>
+              <w:rPr>
+                <w:rFonts w:eastAsia="Times New Roman" w:cs="Calibri"/>
+                <w:color w:val="000000"/>
+                <w:lang w:val="en-IN" w:eastAsia="en-IN" w:bidi="ta-IN"/>
+              </w:rPr>
+              <w:t xml:space="preserve"> Mainframe)</w:t>
             </w:r>
           </w:p>
         </w:tc>
@@ -2315,7 +2492,6 @@
     </w:p>
     <w:p>
       <w:pPr>
-        <w:jc w:val="center"/>
         <w:rPr>
           <w:b/>
           <w:bCs/>
@@ -2331,6 +2507,15 @@
           <w:szCs w:val="24"/>
         </w:rPr>
         <w:t>NEWDAY CARDS AND TECHNOLOGIES</w:t>
+      </w:r>
+      <w:r>
+        <w:rPr>
+          <w:b/>
+          <w:bCs/>
+          <w:sz w:val="24"/>
+          <w:szCs w:val="24"/>
+        </w:rPr>
+        <w:t xml:space="preserve"> (March 2022 – January 2026)</w:t>
       </w:r>
     </w:p>
     <w:p>
@@ -2450,13 +2635,166 @@
           <w:bCs/>
           <w:lang w:val="en-IN"/>
         </w:rPr>
-        <w:t>test plans, Requirement Traceability Matrix (RTM), test scenarios, and test cases</w:t>
+        <w:t>Test Plans</w:t>
+      </w:r>
+      <w:r>
+        <w:rPr>
+          <w:b/>
+          <w:bCs/>
+          <w:lang w:val="en-IN"/>
+        </w:rPr>
+        <w:t xml:space="preserve">, Requirement Traceability Matrix (RTM), </w:t>
+      </w:r>
+      <w:r>
+        <w:rPr>
+          <w:b/>
+          <w:bCs/>
+          <w:lang w:val="en-IN"/>
+        </w:rPr>
+        <w:t>T</w:t>
+      </w:r>
+      <w:r>
+        <w:rPr>
+          <w:b/>
+          <w:bCs/>
+          <w:lang w:val="en-IN"/>
+        </w:rPr>
+        <w:t xml:space="preserve">est scenarios, and </w:t>
+      </w:r>
+      <w:r>
+        <w:rPr>
+          <w:b/>
+          <w:bCs/>
+          <w:lang w:val="en-IN"/>
+        </w:rPr>
+        <w:t>T</w:t>
+      </w:r>
+      <w:r>
+        <w:rPr>
+          <w:b/>
+          <w:bCs/>
+          <w:lang w:val="en-IN"/>
+        </w:rPr>
+        <w:t>est cases</w:t>
       </w:r>
       <w:r>
         <w:rPr>
           <w:lang w:val="en-IN"/>
         </w:rPr>
         <w:t xml:space="preserve"> based on detailed project requirements and specifications.</w:t>
+      </w:r>
+    </w:p>
+    <w:p>
+      <w:pPr>
+        <w:pStyle w:val="ListBullet"/>
+        <w:numPr>
+          <w:ilvl w:val="0"/>
+          <w:numId w:val="19"/>
+        </w:numPr>
+        <w:spacing w:before="0" w:after="80"/>
+        <w:contextualSpacing w:val="0"/>
+        <w:jc w:val="both"/>
+        <w:rPr>
+          <w:lang w:val="en-IN"/>
+        </w:rPr>
+      </w:pPr>
+      <w:r>
+        <w:rPr>
+          <w:b/>
+          <w:bCs/>
+          <w:lang w:val="en-IN"/>
+        </w:rPr>
+        <w:t>Automation Utility development and support</w:t>
+      </w:r>
+      <w:r>
+        <w:rPr>
+          <w:lang w:val="en-IN"/>
+        </w:rPr>
+        <w:t>:</w:t>
+      </w:r>
+      <w:r>
+        <w:rPr>
+          <w:lang w:val="en-IN"/>
+        </w:rPr>
+        <w:t xml:space="preserve"> Explored, implemented and involved in developing automation utilities such as </w:t>
+      </w:r>
+      <w:r>
+        <w:rPr>
+          <w:b/>
+          <w:bCs/>
+          <w:lang w:val="en-IN"/>
+        </w:rPr>
+        <w:t xml:space="preserve">VBS Macro on First Vision, Selenium Python + </w:t>
+      </w:r>
+      <w:proofErr w:type="spellStart"/>
+      <w:r>
+        <w:rPr>
+          <w:b/>
+          <w:bCs/>
+          <w:lang w:val="en-IN"/>
+        </w:rPr>
+        <w:t>Pytest</w:t>
+      </w:r>
+      <w:proofErr w:type="spellEnd"/>
+      <w:r>
+        <w:rPr>
+          <w:b/>
+          <w:bCs/>
+          <w:lang w:val="en-IN"/>
+        </w:rPr>
+        <w:t xml:space="preserve"> </w:t>
+      </w:r>
+      <w:r>
+        <w:rPr>
+          <w:lang w:val="en-IN"/>
+        </w:rPr>
+        <w:t>and</w:t>
+      </w:r>
+      <w:r>
+        <w:rPr>
+          <w:b/>
+          <w:bCs/>
+          <w:lang w:val="en-IN"/>
+        </w:rPr>
+        <w:t xml:space="preserve"> Node. JS </w:t>
+      </w:r>
+      <w:r>
+        <w:rPr>
+          <w:lang w:val="en-IN"/>
+        </w:rPr>
+        <w:t xml:space="preserve"> for bringing efficiency in test data and test execution process. This is  being logged to </w:t>
+      </w:r>
+      <w:r>
+        <w:rPr>
+          <w:i/>
+          <w:iCs/>
+          <w:lang w:val="en-IN"/>
+        </w:rPr>
+        <w:t xml:space="preserve">Cognizant’s </w:t>
+      </w:r>
+      <w:proofErr w:type="spellStart"/>
+      <w:r>
+        <w:rPr>
+          <w:i/>
+          <w:iCs/>
+          <w:lang w:val="en-IN"/>
+        </w:rPr>
+        <w:t>Bluebolt</w:t>
+      </w:r>
+      <w:proofErr w:type="spellEnd"/>
+      <w:r>
+        <w:rPr>
+          <w:i/>
+          <w:iCs/>
+          <w:lang w:val="en-IN"/>
+        </w:rPr>
+        <w:t xml:space="preserve"> Innovation Forum </w:t>
+      </w:r>
+      <w:r>
+        <w:rPr>
+          <w:lang w:val="en-IN"/>
+        </w:rPr>
+        <w:t>as mentioned below.</w:t>
       </w:r>
     </w:p>
     <w:p>
@@ -2653,13 +2991,29 @@
           <w:bCs/>
           <w:lang w:val="en-IN"/>
         </w:rPr>
-        <w:t xml:space="preserve"> Browerstack</w:t>
+        <w:t xml:space="preserve"> </w:t>
+      </w:r>
+      <w:proofErr w:type="spellStart"/>
+      <w:r>
+        <w:rPr>
+          <w:b/>
+          <w:bCs/>
+          <w:lang w:val="en-IN"/>
+        </w:rPr>
+        <w:t>Browerstack</w:t>
+      </w:r>
+      <w:proofErr w:type="spellEnd"/>
+      <w:r>
+        <w:rPr>
+          <w:lang w:val="en-IN"/>
+        </w:rPr>
+        <w:t xml:space="preserve"> for Mobile testing and Snowflake for dataset management</w:t>
       </w:r>
       <w:r>
         <w:rPr>
           <w:lang w:val="en-IN"/>
         </w:rPr>
-        <w:t xml:space="preserve"> for Mobile testing and Snowflake for dataset management, </w:t>
+        <w:t>.</w:t>
       </w:r>
     </w:p>
     <w:p>
@@ -2682,19 +3036,43 @@
         </w:rPr>
         <w:t xml:space="preserve">Have involved in </w:t>
       </w:r>
+      <w:proofErr w:type="spellStart"/>
       <w:r>
         <w:rPr>
           <w:b/>
           <w:bCs/>
           <w:lang w:val="en-IN"/>
         </w:rPr>
-        <w:t>VisionPlus testing</w:t>
+        <w:t>VisionPlus</w:t>
+      </w:r>
+      <w:proofErr w:type="spellEnd"/>
+      <w:r>
+        <w:rPr>
+          <w:b/>
+          <w:bCs/>
+          <w:lang w:val="en-IN"/>
+        </w:rPr>
+        <w:t xml:space="preserve"> testing</w:t>
       </w:r>
       <w:r>
         <w:rPr>
           <w:lang w:val="en-IN"/>
         </w:rPr>
-        <w:t xml:space="preserve"> (under modules FAS, CMS, TRAMS, LMS) on BlueZone Mainframe for testing various credit card functionalities.</w:t>
+        <w:t xml:space="preserve"> (under modules FAS, CMS, TRAMS, LMS) on </w:t>
+      </w:r>
+      <w:proofErr w:type="spellStart"/>
+      <w:r>
+        <w:rPr>
+          <w:lang w:val="en-IN"/>
+        </w:rPr>
+        <w:t>BlueZone</w:t>
+      </w:r>
+      <w:proofErr w:type="spellEnd"/>
+      <w:r>
+        <w:rPr>
+          <w:lang w:val="en-IN"/>
+        </w:rPr>
+        <w:t xml:space="preserve"> Mainframe for testing various credit card functionalities.</w:t>
       </w:r>
     </w:p>
     <w:p>
@@ -2754,67 +3132,6 @@
         </w:rPr>
         <w:t>: Conducted thorough regression testing to validate bug fixes and ensure the stability of the software.</w:t>
       </w:r>
-    </w:p>
-    <w:p>
-      <w:pPr>
-        <w:pStyle w:val="ListBullet"/>
-        <w:numPr>
-          <w:ilvl w:val="0"/>
-          <w:numId w:val="19"/>
-        </w:numPr>
-        <w:spacing w:before="0" w:after="80"/>
-        <w:contextualSpacing w:val="0"/>
-        <w:jc w:val="both"/>
-        <w:rPr>
-          <w:lang w:val="en-IN"/>
-        </w:rPr>
-      </w:pPr>
-      <w:r>
-        <w:rPr>
-          <w:b/>
-          <w:bCs/>
-          <w:lang w:val="en-IN"/>
-        </w:rPr>
-        <w:t>UI and API Testing</w:t>
-      </w:r>
-      <w:r>
-        <w:rPr>
-          <w:lang w:val="en-IN"/>
-        </w:rPr>
-        <w:t>: Developed and executed UI tests and participated actively in API testing to ensure comprehensive test coverage and high-quality assurance.</w:t>
-      </w:r>
-    </w:p>
-    <w:p>
-      <w:pPr>
-        <w:pStyle w:val="ListBullet"/>
-        <w:numPr>
-          <w:ilvl w:val="0"/>
-          <w:numId w:val="0"/>
-        </w:numPr>
-        <w:spacing w:before="0" w:after="80"/>
-        <w:ind w:left="360" w:hanging="360"/>
-        <w:contextualSpacing w:val="0"/>
-        <w:jc w:val="both"/>
-        <w:rPr>
-          <w:lang w:val="en-IN"/>
-        </w:rPr>
-      </w:pPr>
-    </w:p>
-    <w:p>
-      <w:pPr>
-        <w:pStyle w:val="ListBullet"/>
-        <w:numPr>
-          <w:ilvl w:val="0"/>
-          <w:numId w:val="0"/>
-        </w:numPr>
-        <w:spacing w:before="0" w:after="80"/>
-        <w:ind w:left="360" w:hanging="360"/>
-        <w:contextualSpacing w:val="0"/>
-        <w:jc w:val="both"/>
-        <w:rPr>
-          <w:lang w:val="en-IN"/>
-        </w:rPr>
-      </w:pPr>
     </w:p>
     <w:p>
       <w:pPr>
@@ -2983,7 +3300,6 @@
       </w:r>
     </w:p>
     <w:p/>
-    <w:p/>
     <w:p>
       <w:pPr>
         <w:pStyle w:val="Heading1"/>
@@ -3065,7 +3381,13 @@
         <w:rPr>
           <w:bCs/>
         </w:rPr>
-        <w:t>Contribution to</w:t>
+        <w:t xml:space="preserve">Contribution </w:t>
+      </w:r>
+      <w:r>
+        <w:rPr>
+          <w:bCs/>
+        </w:rPr>
+        <w:t>through</w:t>
       </w:r>
       <w:r>
         <w:rPr>
@@ -3077,8 +3399,16 @@
         <w:rPr>
           <w:bCs/>
         </w:rPr>
-        <w:t>Cognizant's Bluebolt</w:t>
+        <w:t xml:space="preserve">Cognizant's </w:t>
       </w:r>
+      <w:proofErr w:type="spellStart"/>
+      <w:r>
+        <w:rPr>
+          <w:bCs/>
+        </w:rPr>
+        <w:t>Bluebolt</w:t>
+      </w:r>
+      <w:proofErr w:type="spellEnd"/>
       <w:r>
         <w:t> Innovatio</w:t>
       </w:r>
@@ -3101,19 +3431,38 @@
         <w:tab/>
       </w:r>
       <w:r>
-        <w:tab/>
+        <w:t xml:space="preserve">2024- </w:t>
+      </w:r>
+      <w:r>
         <w:t>2025</w:t>
       </w:r>
     </w:p>
     <w:p>
       <w:r>
-        <w:t xml:space="preserve">With the opportunity to Cognizant’s BlueBolt Innovation, that creates opportunities for </w:t>
+        <w:t xml:space="preserve">With the opportunity to Cognizant’s </w:t>
+      </w:r>
+      <w:proofErr w:type="spellStart"/>
+      <w:r>
+        <w:t>BlueBolt</w:t>
+      </w:r>
+      <w:proofErr w:type="spellEnd"/>
+      <w:r>
+        <w:t xml:space="preserve"> Innovation</w:t>
       </w:r>
       <w:r>
-        <w:t>developers to record their innovations that brings efficiency to the system development,</w:t>
+        <w:t xml:space="preserve"> Forum</w:t>
       </w:r>
       <w:r>
-        <w:t xml:space="preserve"> we have contributed the following.,</w:t>
+        <w:t xml:space="preserve">, </w:t>
+      </w:r>
+      <w:r>
+        <w:t>we have contributed the following</w:t>
+      </w:r>
+      <w:r>
+        <w:t xml:space="preserve"> that brings efficiency throughout our project test process</w:t>
+      </w:r>
+      <w:r>
+        <w:t>.,</w:t>
       </w:r>
     </w:p>
     <w:p>
@@ -3157,7 +3506,15 @@
           <w:bCs/>
           <w:lang w:val="en-IN"/>
         </w:rPr>
-        <w:t>10+ hours to under 1 hour</w:t>
+        <w:t>6</w:t>
+      </w:r>
+      <w:r>
+        <w:rPr>
+          <w:b/>
+          <w:bCs/>
+          <w:lang w:val="en-IN"/>
+        </w:rPr>
+        <w:t>+ hours to under 1 hour</w:t>
       </w:r>
       <w:r>
         <w:rPr>
@@ -3182,7 +3539,23 @@
           <w:bCs/>
           <w:lang w:val="en-IN"/>
         </w:rPr>
-        <w:t>JSON-to-Database Report Validation Utility</w:t>
+        <w:t>JSON-to-</w:t>
+      </w:r>
+      <w:r>
+        <w:rPr>
+          <w:b/>
+          <w:bCs/>
+          <w:lang w:val="en-IN"/>
+        </w:rPr>
+        <w:t>Table</w:t>
+      </w:r>
+      <w:r>
+        <w:rPr>
+          <w:b/>
+          <w:bCs/>
+          <w:lang w:val="en-IN"/>
+        </w:rPr>
+        <w:t xml:space="preserve"> Report Validation Utility</w:t>
       </w:r>
     </w:p>
     <w:p>
@@ -3232,10 +3605,141 @@
     </w:p>
     <w:p>
       <w:pPr>
+        <w:numPr>
+          <w:ilvl w:val="0"/>
+          <w:numId w:val="23"/>
+        </w:numPr>
         <w:rPr>
           <w:lang w:val="en-IN"/>
         </w:rPr>
       </w:pPr>
+      <w:r>
+        <w:rPr>
+          <w:b/>
+          <w:bCs/>
+          <w:lang w:val="en-IN"/>
+        </w:rPr>
+        <w:t>First Vision VBS based macro development</w:t>
+      </w:r>
+    </w:p>
+    <w:p>
+      <w:pPr>
+        <w:numPr>
+          <w:ilvl w:val="1"/>
+          <w:numId w:val="23"/>
+        </w:numPr>
+        <w:rPr>
+          <w:lang w:val="en-IN"/>
+        </w:rPr>
+      </w:pPr>
+      <w:r>
+        <w:rPr>
+          <w:lang w:val="en-IN"/>
+        </w:rPr>
+        <w:t xml:space="preserve">Implemented VB scripts that can run macro on First Vision platform emulated under Rocket’s </w:t>
+      </w:r>
+      <w:proofErr w:type="spellStart"/>
+      <w:r>
+        <w:rPr>
+          <w:lang w:val="en-IN"/>
+        </w:rPr>
+        <w:t>Bluezone</w:t>
+      </w:r>
+      <w:proofErr w:type="spellEnd"/>
+      <w:r>
+        <w:rPr>
+          <w:lang w:val="en-IN"/>
+        </w:rPr>
+        <w:t xml:space="preserve"> Terminal Emulator – To effectively run data and transaction details inquiry on Multiple accounts for data-driven validations.</w:t>
+      </w:r>
+    </w:p>
+    <w:p>
+      <w:pPr>
+        <w:numPr>
+          <w:ilvl w:val="0"/>
+          <w:numId w:val="23"/>
+        </w:numPr>
+        <w:rPr>
+          <w:lang w:val="en-IN"/>
+        </w:rPr>
+      </w:pPr>
+      <w:r>
+        <w:rPr>
+          <w:b/>
+          <w:bCs/>
+          <w:lang w:val="en-IN"/>
+        </w:rPr>
+        <w:t>Development of DD Automation Framework for Data Staging</w:t>
+      </w:r>
+    </w:p>
+    <w:p>
+      <w:pPr>
+        <w:numPr>
+          <w:ilvl w:val="1"/>
+          <w:numId w:val="23"/>
+        </w:numPr>
+        <w:rPr>
+          <w:lang w:val="en-IN"/>
+        </w:rPr>
+      </w:pPr>
+      <w:r>
+        <w:rPr>
+          <w:lang w:val="en-IN"/>
+        </w:rPr>
+        <w:t xml:space="preserve">As a part of data staging process, we are in need to register the UAT Test accounts on a form-driven UI portal. We utilized </w:t>
+      </w:r>
+      <w:r>
+        <w:rPr>
+          <w:b/>
+          <w:bCs/>
+          <w:lang w:val="en-IN"/>
+        </w:rPr>
+        <w:t xml:space="preserve">Python Selenium plus </w:t>
+      </w:r>
+      <w:proofErr w:type="spellStart"/>
+      <w:r>
+        <w:rPr>
+          <w:b/>
+          <w:bCs/>
+          <w:lang w:val="en-IN"/>
+        </w:rPr>
+        <w:t>PyTest</w:t>
+      </w:r>
+      <w:proofErr w:type="spellEnd"/>
+      <w:r>
+        <w:rPr>
+          <w:lang w:val="en-IN"/>
+        </w:rPr>
+        <w:t xml:space="preserve"> to develop the framework in </w:t>
+      </w:r>
+      <w:r>
+        <w:rPr>
+          <w:b/>
+          <w:bCs/>
+          <w:lang w:val="en-IN"/>
+        </w:rPr>
+        <w:t xml:space="preserve">POM </w:t>
+      </w:r>
+      <w:r>
+        <w:rPr>
+          <w:lang w:val="en-IN"/>
+        </w:rPr>
+        <w:t xml:space="preserve">and </w:t>
+      </w:r>
+      <w:r>
+        <w:rPr>
+          <w:b/>
+          <w:bCs/>
+          <w:lang w:val="en-IN"/>
+        </w:rPr>
+        <w:t xml:space="preserve">Data Driven </w:t>
+      </w:r>
+      <w:r>
+        <w:rPr>
+          <w:lang w:val="en-IN"/>
+        </w:rPr>
+        <w:t>approach. This brings efficiency such that I can stage 200 accounts in 10 minutes through this utility.</w:t>
+      </w:r>
     </w:p>
     <w:p>
       <w:pPr>
@@ -3291,49 +3795,11 @@
         <w:t>entorship Program Contributed around 20+ hours in mentoring freshers and interns in Cognizant Academy under QEA domain, sharing and helping by the best of my knowledge in their curriculum.</w:t>
       </w:r>
     </w:p>
-    <w:p/>
     <w:p>
       <w:pPr>
-        <w:pStyle w:val="Heading2"/>
-        <w:jc w:val="both"/>
+        <w:pStyle w:val="Heading1"/>
       </w:pPr>
-      <w:r>
-        <w:t>Test Evidence Validator | Hack-o-Mania</w:t>
-      </w:r>
-      <w:r>
-        <w:tab/>
-      </w:r>
-      <w:r>
-        <w:tab/>
-      </w:r>
-      <w:r>
-        <w:tab/>
-      </w:r>
-      <w:r>
-        <w:tab/>
-      </w:r>
-      <w:r>
-        <w:tab/>
-      </w:r>
-      <w:r>
-        <w:tab/>
-      </w:r>
-      <w:r>
-        <w:tab/>
-      </w:r>
-      <w:r>
-        <w:t>2022</w:t>
-      </w:r>
     </w:p>
-    <w:p>
-      <w:pPr>
-        <w:jc w:val="both"/>
-      </w:pPr>
-      <w:r>
-        <w:t>Accomplished a Mini project on Test Evidence validation, that captures details on each screenprint, their timings intervals of preceding screenprints.</w:t>
-      </w:r>
-    </w:p>
-    <w:p/>
     <w:p>
       <w:pPr>
         <w:pStyle w:val="Heading1"/>
@@ -3409,7 +3875,23 @@
         <w:jc w:val="both"/>
       </w:pPr>
       <w:r>
-        <w:t>Address: 98/22, Thandavarayan Street, Old Washermanpet, Chennai-600021.</w:t>
+        <w:t xml:space="preserve">Address: 98/22, </w:t>
+      </w:r>
+      <w:proofErr w:type="spellStart"/>
+      <w:r>
+        <w:t>Thandavarayan</w:t>
+      </w:r>
+      <w:proofErr w:type="spellEnd"/>
+      <w:r>
+        <w:t xml:space="preserve"> Street, Old </w:t>
+      </w:r>
+      <w:proofErr w:type="spellStart"/>
+      <w:r>
+        <w:t>Washermanpet</w:t>
+      </w:r>
+      <w:proofErr w:type="spellEnd"/>
+      <w:r>
+        <w:t>, Chennai-600021.</w:t>
       </w:r>
     </w:p>
     <w:p>
@@ -3438,19 +3920,25 @@
       <w:r>
         <w:t>Portfolio:</w:t>
       </w:r>
+      <w:r>
+        <w:t xml:space="preserve"> </w:t>
+      </w:r>
+      <w:r>
+        <w:t>https://bit.ly/haryish_e</w:t>
+      </w:r>
     </w:p>
     <w:p>
       <w:pPr>
-        <w:pStyle w:val="ListParagraph"/>
-        <w:numPr>
-          <w:ilvl w:val="0"/>
-          <w:numId w:val="24"/>
-        </w:numPr>
         <w:spacing w:before="0"/>
         <w:jc w:val="both"/>
       </w:pPr>
+      <w:proofErr w:type="spellStart"/>
       <w:r>
-        <w:t>Github:</w:t>
+        <w:t>Github</w:t>
+      </w:r>
+      <w:proofErr w:type="spellEnd"/>
+      <w:r>
+        <w:t>:</w:t>
       </w:r>
       <w:r>
         <w:t xml:space="preserve"> </w:t>
@@ -3461,19 +3949,14 @@
         </w:r>
       </w:hyperlink>
       <w:r>
-        <w:t xml:space="preserve"> </w:t>
+        <w:tab/>
       </w:r>
-    </w:p>
-    <w:p>
-      <w:pPr>
-        <w:pStyle w:val="ListParagraph"/>
-        <w:numPr>
-          <w:ilvl w:val="0"/>
-          <w:numId w:val="24"/>
-        </w:numPr>
-        <w:spacing w:before="0"/>
-        <w:jc w:val="both"/>
-      </w:pPr>
+      <w:r>
+        <w:tab/>
+      </w:r>
+      <w:r>
+        <w:tab/>
+      </w:r>
       <w:r>
         <w:t xml:space="preserve">LinkedIn: </w:t>
       </w:r>
@@ -3481,15 +3964,6 @@
         <w:t>https://www.linkedin.com/in/haryish/</w:t>
       </w:r>
     </w:p>
-    <w:p>
-      <w:pPr>
-        <w:pStyle w:val="ListParagraph"/>
-        <w:spacing w:before="0"/>
-        <w:jc w:val="both"/>
-      </w:pPr>
-    </w:p>
-    <w:p/>
-    <w:p/>
     <w:sectPr>
       <w:pgSz w:w="12240" w:h="15840"/>
       <w:pgMar w:top="864" w:right="1440" w:bottom="806" w:left="1440" w:header="0" w:footer="720" w:gutter="0"/>
@@ -31138,6 +31612,7 @@
     <w:rsid w:val="001D5399"/>
     <w:rsid w:val="00286914"/>
     <w:rsid w:val="002A5C75"/>
+    <w:rsid w:val="00344E48"/>
     <w:rsid w:val="00395257"/>
     <w:rsid w:val="004C04F3"/>
     <w:rsid w:val="00592E7B"/>
@@ -31145,6 +31620,7 @@
     <w:rsid w:val="007F3C9B"/>
     <w:rsid w:val="00924A96"/>
     <w:rsid w:val="0097644A"/>
+    <w:rsid w:val="00B97156"/>
     <w:rsid w:val="00BB7F9F"/>
     <w:rsid w:val="00BC22DC"/>
     <w:rsid w:val="00BE541F"/>
@@ -31879,35 +32355,6 @@
 </file>
 
 <file path=customXml/item1.xml><?xml version="1.0" encoding="utf-8"?>
-<?mso-contentType ?>
-<FormTemplates xmlns="http://schemas.microsoft.com/sharepoint/v3/contenttype/forms">
-  <Display>DocumentLibraryForm</Display>
-  <Edit>DocumentLibraryForm</Edit>
-  <New>DocumentLibraryForm</New>
-</FormTemplates>
-</file>
-
-<file path=customXml/item2.xml><?xml version="1.0" encoding="utf-8"?>
-<p:properties xmlns:p="http://schemas.microsoft.com/office/2006/metadata/properties" xmlns:xsi="http://www.w3.org/2001/XMLSchema-instance" xmlns:pc="http://schemas.microsoft.com/office/infopath/2007/PartnerControls">
-  <documentManagement>
-    <Background xmlns="71af3243-3dd4-4a8d-8c0d-dd76da1f02a5">false</Background>
-    <Status xmlns="71af3243-3dd4-4a8d-8c0d-dd76da1f02a5">Not started</Status>
-    <_ip_UnifiedCompliancePolicyUIAction xmlns="http://schemas.microsoft.com/sharepoint/v3" xsi:nil="true"/>
-    <Image xmlns="71af3243-3dd4-4a8d-8c0d-dd76da1f02a5">
-      <Url xsi:nil="true"/>
-      <Description xsi:nil="true"/>
-    </Image>
-    <_ip_UnifiedCompliancePolicyProperties xmlns="http://schemas.microsoft.com/sharepoint/v3" xsi:nil="true"/>
-    <ImageTagsTaxHTField xmlns="71af3243-3dd4-4a8d-8c0d-dd76da1f02a5">
-      <Terms xmlns="http://schemas.microsoft.com/office/infopath/2007/PartnerControls"/>
-    </ImageTagsTaxHTField>
-    <TaxCatchAll xmlns="230e9df3-be65-4c73-a93b-d1236ebd677e" xsi:nil="true"/>
-    <MediaServiceKeyPoints xmlns="71af3243-3dd4-4a8d-8c0d-dd76da1f02a5" xsi:nil="true"/>
-  </documentManagement>
-</p:properties>
-</file>
-
-<file path=customXml/item3.xml><?xml version="1.0" encoding="utf-8"?>
 <ct:contentTypeSchema xmlns:ct="http://schemas.microsoft.com/office/2006/metadata/contentType" xmlns:ma="http://schemas.microsoft.com/office/2006/metadata/properties/metaAttributes" ct:_="" ma:_="" ma:contentTypeName="Document" ma:contentTypeID="0x01010079F111ED35F8CC479449609E8A0923A6" ma:contentTypeVersion="28" ma:contentTypeDescription="Create a new document." ma:contentTypeScope="" ma:versionID="60f5a4f2d2b0abadcf532d48ebf9cb71">
   <xsd:schema xmlns:xsd="http://www.w3.org/2001/XMLSchema" xmlns:xs="http://www.w3.org/2001/XMLSchema" xmlns:p="http://schemas.microsoft.com/office/2006/metadata/properties" xmlns:ns1="http://schemas.microsoft.com/sharepoint/v3" xmlns:ns2="71af3243-3dd4-4a8d-8c0d-dd76da1f02a5" xmlns:ns3="16c05727-aa75-4e4a-9b5f-8a80a1165891" xmlns:ns4="230e9df3-be65-4c73-a93b-d1236ebd677e" targetNamespace="http://schemas.microsoft.com/office/2006/metadata/properties" ma:root="true" ma:fieldsID="7dd78129e6a1811f84807ad11c651531" ns1:_="" ns2:_="" ns3:_="" ns4:_="">
     <xsd:import namespace="http://schemas.microsoft.com/sharepoint/v3"/>
@@ -32219,27 +32666,36 @@
 </ct:contentTypeSchema>
 </file>
 
-<file path=customXml/itemProps1.xml><?xml version="1.0" encoding="utf-8"?>
-<ds:datastoreItem xmlns:ds="http://schemas.openxmlformats.org/officeDocument/2006/customXml" ds:itemID="{5D9ED3FD-0EE3-43B5-B701-56BB60CEE482}">
-  <ds:schemaRefs>
-    <ds:schemaRef ds:uri="http://schemas.microsoft.com/sharepoint/v3/contenttype/forms"/>
-  </ds:schemaRefs>
-</ds:datastoreItem>
+<file path=customXml/item2.xml><?xml version="1.0" encoding="utf-8"?>
+<p:properties xmlns:p="http://schemas.microsoft.com/office/2006/metadata/properties" xmlns:xsi="http://www.w3.org/2001/XMLSchema-instance" xmlns:pc="http://schemas.microsoft.com/office/infopath/2007/PartnerControls">
+  <documentManagement>
+    <Background xmlns="71af3243-3dd4-4a8d-8c0d-dd76da1f02a5">false</Background>
+    <Status xmlns="71af3243-3dd4-4a8d-8c0d-dd76da1f02a5">Not started</Status>
+    <_ip_UnifiedCompliancePolicyUIAction xmlns="http://schemas.microsoft.com/sharepoint/v3" xsi:nil="true"/>
+    <Image xmlns="71af3243-3dd4-4a8d-8c0d-dd76da1f02a5">
+      <Url xsi:nil="true"/>
+      <Description xsi:nil="true"/>
+    </Image>
+    <_ip_UnifiedCompliancePolicyProperties xmlns="http://schemas.microsoft.com/sharepoint/v3" xsi:nil="true"/>
+    <ImageTagsTaxHTField xmlns="71af3243-3dd4-4a8d-8c0d-dd76da1f02a5">
+      <Terms xmlns="http://schemas.microsoft.com/office/infopath/2007/PartnerControls"/>
+    </ImageTagsTaxHTField>
+    <TaxCatchAll xmlns="230e9df3-be65-4c73-a93b-d1236ebd677e" xsi:nil="true"/>
+    <MediaServiceKeyPoints xmlns="71af3243-3dd4-4a8d-8c0d-dd76da1f02a5" xsi:nil="true"/>
+  </documentManagement>
+</p:properties>
 </file>
 
-<file path=customXml/itemProps2.xml><?xml version="1.0" encoding="utf-8"?>
-<ds:datastoreItem xmlns:ds="http://schemas.openxmlformats.org/officeDocument/2006/customXml" ds:itemID="{2B9F8D08-1D9B-4293-B753-AE33123B7366}">
-  <ds:schemaRefs>
-    <ds:schemaRef ds:uri="http://schemas.microsoft.com/office/2006/metadata/properties"/>
-    <ds:schemaRef ds:uri="http://schemas.microsoft.com/office/infopath/2007/PartnerControls"/>
-    <ds:schemaRef ds:uri="71af3243-3dd4-4a8d-8c0d-dd76da1f02a5"/>
-    <ds:schemaRef ds:uri="http://schemas.microsoft.com/sharepoint/v3"/>
-    <ds:schemaRef ds:uri="230e9df3-be65-4c73-a93b-d1236ebd677e"/>
-  </ds:schemaRefs>
-</ds:datastoreItem>
+<file path=customXml/item3.xml><?xml version="1.0" encoding="utf-8"?>
+<?mso-contentType ?>
+<FormTemplates xmlns="http://schemas.microsoft.com/sharepoint/v3/contenttype/forms">
+  <Display>DocumentLibraryForm</Display>
+  <Edit>DocumentLibraryForm</Edit>
+  <New>DocumentLibraryForm</New>
+</FormTemplates>
 </file>
 
-<file path=customXml/itemProps3.xml><?xml version="1.0" encoding="utf-8"?>
+<file path=customXml/itemProps1.xml><?xml version="1.0" encoding="utf-8"?>
 <ds:datastoreItem xmlns:ds="http://schemas.openxmlformats.org/officeDocument/2006/customXml" ds:itemID="{924B9342-DE5E-463A-B17E-59B0041872FD}">
   <ds:schemaRefs>
     <ds:schemaRef ds:uri="http://schemas.microsoft.com/office/2006/metadata/contentType"/>
@@ -32260,6 +32716,26 @@
 </ds:datastoreItem>
 </file>
 
+<file path=customXml/itemProps2.xml><?xml version="1.0" encoding="utf-8"?>
+<ds:datastoreItem xmlns:ds="http://schemas.openxmlformats.org/officeDocument/2006/customXml" ds:itemID="{2B9F8D08-1D9B-4293-B753-AE33123B7366}">
+  <ds:schemaRefs>
+    <ds:schemaRef ds:uri="http://schemas.microsoft.com/office/2006/metadata/properties"/>
+    <ds:schemaRef ds:uri="http://schemas.microsoft.com/office/infopath/2007/PartnerControls"/>
+    <ds:schemaRef ds:uri="71af3243-3dd4-4a8d-8c0d-dd76da1f02a5"/>
+    <ds:schemaRef ds:uri="http://schemas.microsoft.com/sharepoint/v3"/>
+    <ds:schemaRef ds:uri="230e9df3-be65-4c73-a93b-d1236ebd677e"/>
+  </ds:schemaRefs>
+</ds:datastoreItem>
+</file>
+
+<file path=customXml/itemProps3.xml><?xml version="1.0" encoding="utf-8"?>
+<ds:datastoreItem xmlns:ds="http://schemas.openxmlformats.org/officeDocument/2006/customXml" ds:itemID="{5D9ED3FD-0EE3-43B5-B701-56BB60CEE482}">
+  <ds:schemaRefs>
+    <ds:schemaRef ds:uri="http://schemas.microsoft.com/sharepoint/v3/contenttype/forms"/>
+  </ds:schemaRefs>
+</ds:datastoreItem>
+</file>
+
 <file path=docMetadata/LabelInfo.xml><?xml version="1.0" encoding="utf-8"?>
 <clbl:labelList xmlns:clbl="http://schemas.microsoft.com/office/2020/mipLabelMetadata"/>
 </file>
</xml_diff>

<commit_message>
Added Domain Specific documents plus Jenkins E2E Flow
</commit_message>
<xml_diff>
--- a/Profile Insights/HaryishElangumaranQA-MODEL2.docx
+++ b/Profile Insights/HaryishElangumaranQA-MODEL2.docx
@@ -359,7 +359,41 @@
         <w:rPr>
           <w:lang w:val="en-IN"/>
         </w:rPr>
-        <w:t> to enhance testing efficiency and coverage.</w:t>
+        <w:t> </w:t>
+      </w:r>
+      <w:r>
+        <w:rPr>
+          <w:lang w:val="en-IN"/>
+        </w:rPr>
+        <w:t xml:space="preserve">and also CI Pipelines using </w:t>
+      </w:r>
+      <w:r>
+        <w:rPr>
+          <w:b/>
+          <w:bCs/>
+          <w:lang w:val="en-IN"/>
+        </w:rPr>
+        <w:t xml:space="preserve">GitHub Actions </w:t>
+      </w:r>
+      <w:r>
+        <w:rPr>
+          <w:lang w:val="en-IN"/>
+        </w:rPr>
+        <w:t xml:space="preserve">and </w:t>
+      </w:r>
+      <w:r>
+        <w:rPr>
+          <w:b/>
+          <w:bCs/>
+          <w:lang w:val="en-IN"/>
+        </w:rPr>
+        <w:t>Jenkins</w:t>
+      </w:r>
+      <w:r>
+        <w:rPr>
+          <w:lang w:val="en-IN"/>
+        </w:rPr>
+        <w:t>.</w:t>
       </w:r>
     </w:p>
     <w:p>
@@ -376,49 +410,13 @@
         <w:rPr>
           <w:lang w:val="en-IN"/>
         </w:rPr>
-        <w:t>Hands-on experience with </w:t>
-      </w:r>
-      <w:r>
-        <w:rPr>
-          <w:b/>
-          <w:bCs/>
-          <w:lang w:val="en-IN"/>
-        </w:rPr>
-        <w:t>CI/CD pipelines</w:t>
+        <w:t>P</w:t>
       </w:r>
       <w:r>
         <w:rPr>
           <w:lang w:val="en-IN"/>
         </w:rPr>
-        <w:t> using </w:t>
-      </w:r>
-      <w:r>
-        <w:rPr>
-          <w:b/>
-          <w:bCs/>
-          <w:lang w:val="en-IN"/>
-        </w:rPr>
-        <w:t>Jenkins</w:t>
-      </w:r>
-      <w:r>
-        <w:rPr>
-          <w:lang w:val="en-IN"/>
-        </w:rPr>
-        <w:t> and </w:t>
-      </w:r>
-      <w:r>
-        <w:rPr>
-          <w:b/>
-          <w:bCs/>
-          <w:lang w:val="en-IN"/>
-        </w:rPr>
-        <w:t>GitHub Actions</w:t>
-      </w:r>
-      <w:r>
-        <w:rPr>
-          <w:lang w:val="en-IN"/>
-        </w:rPr>
-        <w:t>, and proficient with tools like </w:t>
+        <w:t>roficient with tools like </w:t>
       </w:r>
       <w:r>
         <w:rPr>
@@ -1062,7 +1060,19 @@
         <w:rPr>
           <w:lang w:val="en-IN"/>
         </w:rPr>
-        <w:t> for CI/CD processes.</w:t>
+        <w:t> for CI</w:t>
+      </w:r>
+      <w:r>
+        <w:rPr>
+          <w:lang w:val="en-IN"/>
+        </w:rPr>
+        <w:t>/CD</w:t>
+      </w:r>
+      <w:r>
+        <w:rPr>
+          <w:lang w:val="en-IN"/>
+        </w:rPr>
+        <w:t xml:space="preserve"> processes.</w:t>
       </w:r>
     </w:p>
     <w:p>
@@ -1175,6 +1185,10 @@
     <w:p>
       <w:pPr>
         <w:pStyle w:val="Heading2"/>
+        <w:rPr>
+          <w:b w:val="0"/>
+          <w:bCs/>
+        </w:rPr>
       </w:pPr>
       <w:r>
         <w:rPr>
@@ -1199,6 +1213,9 @@
       </w:r>
       <w:r>
         <w:t xml:space="preserve"> (MCA)</w:t>
+      </w:r>
+      <w:r>
+        <w:t xml:space="preserve">   </w:t>
       </w:r>
     </w:p>
     <w:p>
@@ -1407,6 +1424,7 @@
           <w:p>
             <w:pPr>
               <w:spacing w:before="0"/>
+              <w:jc w:val="both"/>
               <w:rPr>
                 <w:rFonts w:eastAsia="Times New Roman" w:cs="Calibri"/>
                 <w:b/>
@@ -1436,6 +1454,7 @@
           <w:p>
             <w:pPr>
               <w:spacing w:before="0"/>
+              <w:jc w:val="center"/>
               <w:rPr>
                 <w:rFonts w:eastAsia="Times New Roman" w:cs="Calibri"/>
                 <w:color w:val="000000"/>
@@ -1466,6 +1485,7 @@
           <w:p>
             <w:pPr>
               <w:spacing w:before="0"/>
+              <w:jc w:val="both"/>
               <w:rPr>
                 <w:rFonts w:eastAsia="Times New Roman" w:cs="Calibri"/>
                 <w:b/>
@@ -1495,6 +1515,7 @@
           <w:p>
             <w:pPr>
               <w:spacing w:before="0"/>
+              <w:jc w:val="center"/>
               <w:rPr>
                 <w:rFonts w:eastAsia="Times New Roman" w:cs="Calibri"/>
                 <w:color w:val="000000"/>
@@ -1539,7 +1560,7 @@
                 <w:color w:val="000000"/>
                 <w:lang w:val="en-IN" w:eastAsia="en-IN" w:bidi="ta-IN"/>
               </w:rPr>
-              <w:t xml:space="preserve">| Agile </w:t>
+              <w:t>| Agile</w:t>
             </w:r>
           </w:p>
         </w:tc>
@@ -1557,6 +1578,7 @@
           <w:p>
             <w:pPr>
               <w:spacing w:before="0"/>
+              <w:jc w:val="both"/>
               <w:rPr>
                 <w:rFonts w:eastAsia="Times New Roman" w:cs="Calibri"/>
                 <w:b/>
@@ -1586,6 +1608,7 @@
           <w:p>
             <w:pPr>
               <w:spacing w:before="0"/>
+              <w:jc w:val="center"/>
               <w:rPr>
                 <w:rFonts w:eastAsia="Times New Roman" w:cs="Calibri"/>
                 <w:color w:val="000000"/>
@@ -1632,6 +1655,7 @@
           <w:p>
             <w:pPr>
               <w:spacing w:before="0"/>
+              <w:jc w:val="both"/>
               <w:rPr>
                 <w:rFonts w:eastAsia="Times New Roman" w:cs="Calibri"/>
                 <w:b/>
@@ -1661,6 +1685,7 @@
           <w:p>
             <w:pPr>
               <w:spacing w:before="0"/>
+              <w:jc w:val="center"/>
               <w:rPr>
                 <w:rFonts w:eastAsia="Times New Roman" w:cs="Calibri"/>
                 <w:color w:val="000000"/>
@@ -1691,6 +1716,7 @@
           <w:p>
             <w:pPr>
               <w:spacing w:before="0"/>
+              <w:jc w:val="both"/>
               <w:rPr>
                 <w:rFonts w:eastAsia="Times New Roman" w:cs="Calibri"/>
                 <w:b/>
@@ -1720,6 +1746,7 @@
           <w:p>
             <w:pPr>
               <w:spacing w:before="0"/>
+              <w:jc w:val="center"/>
               <w:rPr>
                 <w:rFonts w:eastAsia="Times New Roman" w:cs="Calibri"/>
                 <w:color w:val="000000"/>
@@ -1766,6 +1793,7 @@
           <w:p>
             <w:pPr>
               <w:spacing w:before="0"/>
+              <w:jc w:val="both"/>
               <w:rPr>
                 <w:rFonts w:eastAsia="Times New Roman" w:cs="Calibri"/>
                 <w:b/>
@@ -1805,6 +1833,7 @@
           <w:p>
             <w:pPr>
               <w:spacing w:before="0"/>
+              <w:jc w:val="center"/>
               <w:rPr>
                 <w:rFonts w:eastAsia="Times New Roman" w:cs="Calibri"/>
                 <w:color w:val="000000"/>
@@ -1835,6 +1864,7 @@
           <w:p>
             <w:pPr>
               <w:spacing w:before="0"/>
+              <w:jc w:val="both"/>
               <w:rPr>
                 <w:rFonts w:eastAsia="Times New Roman" w:cs="Calibri"/>
                 <w:b/>
@@ -1864,6 +1894,7 @@
           <w:p>
             <w:pPr>
               <w:spacing w:before="0"/>
+              <w:jc w:val="center"/>
               <w:rPr>
                 <w:rFonts w:eastAsia="Times New Roman" w:cs="Calibri"/>
                 <w:color w:val="000000"/>
@@ -1926,6 +1957,7 @@
           <w:p>
             <w:pPr>
               <w:spacing w:before="0"/>
+              <w:jc w:val="both"/>
               <w:rPr>
                 <w:rFonts w:eastAsia="Times New Roman" w:cs="Calibri"/>
                 <w:b/>
@@ -1955,6 +1987,7 @@
           <w:p>
             <w:pPr>
               <w:spacing w:before="0"/>
+              <w:jc w:val="center"/>
               <w:rPr>
                 <w:rFonts w:eastAsia="Times New Roman" w:cs="Calibri"/>
                 <w:color w:val="000000"/>
@@ -2045,6 +2078,14 @@
               </w:rPr>
               <w:t>|Robot</w:t>
             </w:r>
+            <w:r>
+              <w:rPr>
+                <w:rFonts w:eastAsia="Times New Roman" w:cs="Calibri"/>
+                <w:color w:val="000000"/>
+                <w:lang w:val="en-IN" w:eastAsia="en-IN" w:bidi="ta-IN"/>
+              </w:rPr>
+              <w:t xml:space="preserve"> | Maven | POM</w:t>
+            </w:r>
           </w:p>
         </w:tc>
       </w:tr>
@@ -2061,6 +2102,7 @@
           <w:p>
             <w:pPr>
               <w:spacing w:before="0"/>
+              <w:jc w:val="both"/>
               <w:rPr>
                 <w:rFonts w:eastAsia="Times New Roman" w:cs="Calibri"/>
                 <w:b/>
@@ -2090,6 +2132,7 @@
           <w:p>
             <w:pPr>
               <w:spacing w:before="0"/>
+              <w:jc w:val="center"/>
               <w:rPr>
                 <w:rFonts w:eastAsia="Times New Roman" w:cs="Calibri"/>
                 <w:color w:val="000000"/>
@@ -2120,6 +2163,7 @@
           <w:p>
             <w:pPr>
               <w:spacing w:before="0"/>
+              <w:jc w:val="both"/>
               <w:rPr>
                 <w:rFonts w:eastAsia="Times New Roman" w:cs="Calibri"/>
                 <w:b/>
@@ -2149,6 +2193,7 @@
           <w:p>
             <w:pPr>
               <w:spacing w:before="0"/>
+              <w:jc w:val="center"/>
               <w:rPr>
                 <w:rFonts w:eastAsia="Times New Roman" w:cs="Calibri"/>
                 <w:color w:val="000000"/>
@@ -2197,6 +2242,7 @@
           <w:p>
             <w:pPr>
               <w:spacing w:before="0"/>
+              <w:jc w:val="both"/>
               <w:rPr>
                 <w:rFonts w:eastAsia="Times New Roman" w:cs="Calibri"/>
                 <w:b/>
@@ -2226,6 +2272,7 @@
           <w:p>
             <w:pPr>
               <w:spacing w:before="0"/>
+              <w:jc w:val="center"/>
               <w:rPr>
                 <w:rFonts w:eastAsia="Times New Roman" w:cs="Calibri"/>
                 <w:color w:val="000000"/>
@@ -2272,6 +2319,7 @@
           <w:p>
             <w:pPr>
               <w:spacing w:before="0"/>
+              <w:jc w:val="both"/>
               <w:rPr>
                 <w:rFonts w:eastAsia="Times New Roman" w:cs="Calibri"/>
                 <w:b/>
@@ -2301,6 +2349,7 @@
           <w:p>
             <w:pPr>
               <w:spacing w:before="0"/>
+              <w:jc w:val="center"/>
               <w:rPr>
                 <w:rFonts w:eastAsia="Times New Roman" w:cs="Calibri"/>
                 <w:color w:val="000000"/>
@@ -2347,6 +2396,7 @@
           <w:p>
             <w:pPr>
               <w:spacing w:before="0"/>
+              <w:jc w:val="both"/>
               <w:rPr>
                 <w:rFonts w:eastAsia="Times New Roman" w:cs="Calibri"/>
                 <w:b/>
@@ -2376,6 +2426,7 @@
           <w:p>
             <w:pPr>
               <w:spacing w:before="0"/>
+              <w:jc w:val="center"/>
               <w:rPr>
                 <w:rFonts w:eastAsia="Times New Roman" w:cs="Calibri"/>
                 <w:color w:val="000000"/>
@@ -2407,6 +2458,33 @@
                 <w:lang w:val="en-IN" w:eastAsia="en-IN" w:bidi="ta-IN"/>
               </w:rPr>
               <w:t xml:space="preserve"> Mainframe)</w:t>
+            </w:r>
+          </w:p>
+          <w:p>
+            <w:pPr>
+              <w:spacing w:before="0"/>
+              <w:jc w:val="center"/>
+              <w:rPr>
+                <w:rFonts w:eastAsia="Times New Roman" w:cs="Calibri"/>
+                <w:color w:val="000000"/>
+                <w:lang w:val="en-IN" w:eastAsia="en-IN" w:bidi="ta-IN"/>
+              </w:rPr>
+            </w:pPr>
+            <w:r>
+              <w:rPr>
+                <w:rFonts w:eastAsia="Times New Roman" w:cs="Calibri"/>
+                <w:color w:val="000000"/>
+                <w:lang w:val="en-IN" w:eastAsia="en-IN" w:bidi="ta-IN"/>
+              </w:rPr>
+              <w:t xml:space="preserve">Modules: </w:t>
+            </w:r>
+            <w:r>
+              <w:rPr>
+                <w:rFonts w:eastAsia="Times New Roman" w:cs="Calibri"/>
+                <w:color w:val="000000"/>
+                <w:lang w:eastAsia="en-IN" w:bidi="ta-IN"/>
+              </w:rPr>
+              <w:t>CMS, TRAMS, LMS, and Authorization</w:t>
             </w:r>
           </w:p>
         </w:tc>
@@ -2592,8 +2670,22 @@
         <w:rPr>
           <w:lang w:val="en-IN"/>
         </w:rPr>
-        <w:t>. My responsibilities included</w:t>
+        <w:t xml:space="preserve">. My responsibilities </w:t>
       </w:r>
+      <w:proofErr w:type="spellStart"/>
+      <w:r>
+        <w:rPr>
+          <w:lang w:val="en-IN"/>
+        </w:rPr>
+        <w:t>includ</w:t>
+      </w:r>
+      <w:r>
+        <w:rPr>
+          <w:lang w:val="en-IN"/>
+        </w:rPr>
+        <w:t>s</w:t>
+      </w:r>
+      <w:proofErr w:type="spellEnd"/>
       <w:r>
         <w:rPr>
           <w:lang w:val="en-IN"/>
@@ -2643,7 +2735,15 @@
           <w:bCs/>
           <w:lang w:val="en-IN"/>
         </w:rPr>
-        <w:t xml:space="preserve">, Requirement Traceability Matrix (RTM), </w:t>
+        <w:t xml:space="preserve">, </w:t>
+      </w:r>
+      <w:r>
+        <w:rPr>
+          <w:b/>
+          <w:bCs/>
+          <w:lang w:val="en-IN"/>
+        </w:rPr>
+        <w:t xml:space="preserve">RTM, </w:t>
       </w:r>
       <w:r>
         <w:rPr>
@@ -2659,7 +2759,21 @@
           <w:bCs/>
           <w:lang w:val="en-IN"/>
         </w:rPr>
-        <w:t xml:space="preserve">est scenarios, and </w:t>
+        <w:t xml:space="preserve">est scenarios, </w:t>
+      </w:r>
+      <w:r>
+        <w:rPr>
+          <w:lang w:val="en-IN"/>
+        </w:rPr>
+        <w:t>and</w:t>
+      </w:r>
+      <w:r>
+        <w:rPr>
+          <w:b/>
+          <w:bCs/>
+          <w:lang w:val="en-IN"/>
+        </w:rPr>
+        <w:t xml:space="preserve"> </w:t>
       </w:r>
       <w:r>
         <w:rPr>
@@ -2716,7 +2830,19 @@
         <w:rPr>
           <w:lang w:val="en-IN"/>
         </w:rPr>
-        <w:t xml:space="preserve"> Explored, implemented and involved in developing automation utilities such as </w:t>
+        <w:t xml:space="preserve"> Explored, implemented and involved in developing automation utilities</w:t>
+      </w:r>
+      <w:r>
+        <w:rPr>
+          <w:lang w:val="en-IN"/>
+        </w:rPr>
+        <w:t xml:space="preserve"> through technologies</w:t>
+      </w:r>
+      <w:r>
+        <w:rPr>
+          <w:lang w:val="en-IN"/>
+        </w:rPr>
+        <w:t xml:space="preserve"> such as </w:t>
       </w:r>
       <w:r>
         <w:rPr>
@@ -3031,49 +3157,58 @@
         </w:rPr>
       </w:pPr>
       <w:r>
-        <w:rPr>
-          <w:lang w:val="en-IN"/>
-        </w:rPr>
-        <w:t xml:space="preserve">Have involved in </w:t>
+        <w:t xml:space="preserve">Experience in </w:t>
       </w:r>
       <w:proofErr w:type="spellStart"/>
       <w:r>
         <w:rPr>
           <w:b/>
           <w:bCs/>
-          <w:lang w:val="en-IN"/>
         </w:rPr>
-        <w:t>VisionPlus</w:t>
+        <w:t>FirstVision</w:t>
       </w:r>
       <w:proofErr w:type="spellEnd"/>
       <w:r>
         <w:rPr>
           <w:b/>
           <w:bCs/>
-          <w:lang w:val="en-IN"/>
         </w:rPr>
-        <w:t xml:space="preserve"> testing</w:t>
-      </w:r>
-      <w:r>
-        <w:rPr>
-          <w:lang w:val="en-IN"/>
-        </w:rPr>
-        <w:t xml:space="preserve"> (under modules FAS, CMS, TRAMS, LMS) on </w:t>
+        <w:t xml:space="preserve"> (</w:t>
       </w:r>
       <w:proofErr w:type="spellStart"/>
       <w:r>
         <w:rPr>
-          <w:lang w:val="en-IN"/>
+          <w:b/>
+          <w:bCs/>
         </w:rPr>
-        <w:t>BlueZone</w:t>
+        <w:t>VisionPLUS</w:t>
       </w:r>
       <w:proofErr w:type="spellEnd"/>
       <w:r>
         <w:rPr>
-          <w:lang w:val="en-IN"/>
+          <w:b/>
+          <w:bCs/>
         </w:rPr>
-        <w:t xml:space="preserve"> Mainframe for testing various credit card functionalities.</w:t>
+        <w:t>)</w:t>
       </w:r>
+      <w:r>
+        <w:t xml:space="preserve"> testing across </w:t>
+      </w:r>
+      <w:r>
+        <w:rPr>
+          <w:b/>
+          <w:bCs/>
+        </w:rPr>
+        <w:t>CMS, TRAMS, LMS, and Authorization</w:t>
+      </w:r>
+      <w:r>
+        <w:t xml:space="preserve"> modules using </w:t>
+      </w:r>
+      <w:proofErr w:type="spellStart"/>
+      <w:r>
+        <w:t>BlueZone</w:t>
+      </w:r>
+      <w:proofErr w:type="spellEnd"/>
     </w:p>
     <w:p>
       <w:pPr>
@@ -3106,39 +3241,14 @@
     </w:p>
     <w:p>
       <w:pPr>
-        <w:pStyle w:val="ListBullet"/>
-        <w:numPr>
-          <w:ilvl w:val="0"/>
-          <w:numId w:val="19"/>
-        </w:numPr>
-        <w:spacing w:before="0" w:after="80"/>
-        <w:contextualSpacing w:val="0"/>
-        <w:jc w:val="both"/>
-        <w:rPr>
-          <w:lang w:val="en-IN"/>
-        </w:rPr>
+        <w:pStyle w:val="Heading1"/>
       </w:pPr>
-      <w:r>
-        <w:rPr>
-          <w:b/>
-          <w:bCs/>
-          <w:lang w:val="en-IN"/>
-        </w:rPr>
-        <w:t>Regression Testing</w:t>
-      </w:r>
-      <w:r>
-        <w:rPr>
-          <w:lang w:val="en-IN"/>
-        </w:rPr>
-        <w:t>: Conducted thorough regression testing to validate bug fixes and ensure the stability of the software.</w:t>
-      </w:r>
     </w:p>
     <w:p>
       <w:pPr>
         <w:pStyle w:val="Heading1"/>
       </w:pPr>
       <w:r>
-        <w:lastRenderedPageBreak/>
         <w:t>COURSE AND CERTIFICATION</w:t>
       </w:r>
     </w:p>
@@ -6680,7 +6790,6 @@
   <w:style w:type="character" w:default="1" w:styleId="DefaultParagraphFont">
     <w:name w:val="Default Paragraph Font"/>
     <w:uiPriority w:val="1"/>
-    <w:semiHidden/>
     <w:unhideWhenUsed/>
   </w:style>
   <w:style w:type="table" w:default="1" w:styleId="TableNormal">
@@ -31506,7 +31615,7 @@
     <w:charset w:val="00"/>
     <w:family w:val="swiss"/>
     <w:pitch w:val="variable"/>
-    <w:sig w:usb0="E4002EFF" w:usb1="C000247B" w:usb2="00000009" w:usb3="00000000" w:csb0="000001FF" w:csb1="00000000"/>
+    <w:sig w:usb0="E4002EFF" w:usb1="C200247B" w:usb2="00000009" w:usb3="00000000" w:csb0="000001FF" w:csb1="00000000"/>
   </w:font>
   <w:font w:name="MS Mincho">
     <w:altName w:val="ＭＳ 明朝"/>
@@ -31579,7 +31688,7 @@
     <w:charset w:val="00"/>
     <w:family w:val="swiss"/>
     <w:pitch w:val="variable"/>
-    <w:sig w:usb0="E4002EFF" w:usb1="C000247B" w:usb2="00000009" w:usb3="00000000" w:csb0="000001FF" w:csb1="00000000"/>
+    <w:sig w:usb0="E4002EFF" w:usb1="C200247B" w:usb2="00000009" w:usb3="00000000" w:csb0="000001FF" w:csb1="00000000"/>
   </w:font>
   <w:font w:name="Yu Gothic Light">
     <w:panose1 w:val="020B0300000000000000"/>
@@ -31608,6 +31717,7 @@
   <w:rsids>
     <w:rsidRoot w:val="001D5399"/>
     <w:rsid w:val="000A2301"/>
+    <w:rsid w:val="001952A9"/>
     <w:rsid w:val="001B3AB2"/>
     <w:rsid w:val="001D5399"/>
     <w:rsid w:val="00286914"/>
@@ -31615,9 +31725,12 @@
     <w:rsid w:val="00344E48"/>
     <w:rsid w:val="00395257"/>
     <w:rsid w:val="004C04F3"/>
+    <w:rsid w:val="00524D23"/>
     <w:rsid w:val="00592E7B"/>
     <w:rsid w:val="00647800"/>
+    <w:rsid w:val="007A71EF"/>
     <w:rsid w:val="007F3C9B"/>
+    <w:rsid w:val="00861BA3"/>
     <w:rsid w:val="00924A96"/>
     <w:rsid w:val="0097644A"/>
     <w:rsid w:val="00B97156"/>

</xml_diff>